<commit_message>
Updated 70 kHz schools
Used 120 kHz school definitions in Echoview then reran biomass estimates and bootstrap estimates. Updated Tables.docx
</commit_message>
<xml_diff>
--- a/figures/Tables.docx
+++ b/figures/Tables.docx
@@ -16,7 +16,23 @@
           <w:sz w:val="24"/>
           <w:szCs w:val="24"/>
         </w:rPr>
-        <w:t>Table 1. School detection settings used to estimate the density of krill schools during the 2023/24 austral summer glider deployments.</w:t>
+        <w:t>Table 1. School detection settings used to estimate the density of krill schools during the 2023/24 austral summer glider deployments</w:t>
+      </w:r>
+      <w:r>
+        <w:rPr>
+          <w:rFonts w:ascii="Garamond" w:hAnsi="Garamond"/>
+          <w:sz w:val="24"/>
+          <w:szCs w:val="24"/>
+        </w:rPr>
+        <w:t xml:space="preserve"> with a -75 dB threshold</w:t>
+      </w:r>
+      <w:r>
+        <w:rPr>
+          <w:rFonts w:ascii="Garamond" w:hAnsi="Garamond"/>
+          <w:sz w:val="24"/>
+          <w:szCs w:val="24"/>
+        </w:rPr>
+        <w:t>.</w:t>
       </w:r>
     </w:p>
     <w:p>
@@ -3969,14 +3985,6 @@
                 <w:szCs w:val="24"/>
               </w:rPr>
             </w:pPr>
-            <w:r>
-              <w:rPr>
-                <w:rFonts w:ascii="Garamond" w:hAnsi="Garamond"/>
-                <w:sz w:val="24"/>
-                <w:szCs w:val="24"/>
-              </w:rPr>
-              <w:t>70 kHz school count</w:t>
-            </w:r>
           </w:p>
         </w:tc>
         <w:tc>
@@ -4130,7 +4138,7 @@
                 <w:sz w:val="24"/>
                 <w:szCs w:val="24"/>
               </w:rPr>
-              <w:t>39.66</w:t>
+              <w:t>39.04</w:t>
             </w:r>
           </w:p>
         </w:tc>
@@ -4153,7 +4161,7 @@
                 <w:sz w:val="24"/>
                 <w:szCs w:val="24"/>
               </w:rPr>
-              <w:t>92.59</w:t>
+              <w:t>92.16</w:t>
             </w:r>
           </w:p>
         </w:tc>
@@ -4170,22 +4178,6 @@
                 <w:szCs w:val="24"/>
               </w:rPr>
             </w:pPr>
-            <w:r>
-              <w:rPr>
-                <w:rFonts w:ascii="Garamond" w:hAnsi="Garamond"/>
-                <w:sz w:val="24"/>
-                <w:szCs w:val="24"/>
-              </w:rPr>
-              <w:t>97</w:t>
-            </w:r>
-            <w:r>
-              <w:rPr>
-                <w:rFonts w:ascii="Garamond" w:hAnsi="Garamond"/>
-                <w:sz w:val="24"/>
-                <w:szCs w:val="24"/>
-              </w:rPr>
-              <w:t>1</w:t>
-            </w:r>
           </w:p>
         </w:tc>
         <w:tc>
@@ -4311,7 +4303,7 @@
                 <w:sz w:val="24"/>
                 <w:szCs w:val="24"/>
               </w:rPr>
-              <w:t>38.34</w:t>
+              <w:t>37.54</w:t>
             </w:r>
           </w:p>
         </w:tc>
@@ -4334,7 +4326,7 @@
                 <w:sz w:val="24"/>
                 <w:szCs w:val="24"/>
               </w:rPr>
-              <w:t>103.64</w:t>
+              <w:t>103.20</w:t>
             </w:r>
           </w:p>
         </w:tc>
@@ -4351,14 +4343,6 @@
                 <w:szCs w:val="24"/>
               </w:rPr>
             </w:pPr>
-            <w:r>
-              <w:rPr>
-                <w:rFonts w:ascii="Garamond" w:hAnsi="Garamond"/>
-                <w:sz w:val="24"/>
-                <w:szCs w:val="24"/>
-              </w:rPr>
-              <w:t>788</w:t>
-            </w:r>
           </w:p>
         </w:tc>
         <w:tc>
@@ -5883,15 +5867,7 @@
           <w:sz w:val="24"/>
           <w:szCs w:val="24"/>
         </w:rPr>
-        <w:t xml:space="preserve"> </w:t>
-      </w:r>
-      <w:r>
-        <w:rPr>
-          <w:rFonts w:ascii="Garamond" w:hAnsi="Garamond"/>
-          <w:sz w:val="24"/>
-          <w:szCs w:val="24"/>
-        </w:rPr>
-        <w:t>survey</w:t>
+        <w:t xml:space="preserve"> survey</w:t>
       </w:r>
       <w:r>
         <w:rPr>
@@ -6208,7 +6184,7 @@
                 <w:sz w:val="24"/>
                 <w:szCs w:val="24"/>
               </w:rPr>
-              <w:t>50.37</w:t>
+              <w:t>48.40</w:t>
             </w:r>
           </w:p>
         </w:tc>
@@ -6231,7 +6207,7 @@
                 <w:sz w:val="24"/>
                 <w:szCs w:val="24"/>
               </w:rPr>
-              <w:t>35.37</w:t>
+              <w:t>33.73</w:t>
             </w:r>
           </w:p>
         </w:tc>
@@ -6255,7 +6231,7 @@
                 <w:sz w:val="24"/>
                 <w:szCs w:val="24"/>
               </w:rPr>
-              <w:t>82.68</w:t>
+              <w:t>90.90</w:t>
             </w:r>
           </w:p>
         </w:tc>
@@ -6403,7 +6379,7 @@
                 <w:sz w:val="24"/>
                 <w:szCs w:val="24"/>
               </w:rPr>
-              <w:t>43.95</w:t>
+              <w:t>43.71</w:t>
             </w:r>
           </w:p>
         </w:tc>
@@ -6426,7 +6402,7 @@
                 <w:sz w:val="24"/>
                 <w:szCs w:val="24"/>
               </w:rPr>
-              <w:t>26.59</w:t>
+              <w:t>26.17</w:t>
             </w:r>
           </w:p>
         </w:tc>
@@ -6450,7 +6426,7 @@
                 <w:sz w:val="24"/>
                 <w:szCs w:val="24"/>
               </w:rPr>
-              <w:t>99.43</w:t>
+              <w:t>107.33</w:t>
             </w:r>
           </w:p>
         </w:tc>

</xml_diff>

<commit_message>
updated code, data, figures, and tables for data down to 250m
</commit_message>
<xml_diff>
--- a/figures/Tables.docx
+++ b/figures/Tables.docx
@@ -3508,7 +3508,7 @@
                 <w:sz w:val="24"/>
                 <w:szCs w:val="24"/>
               </w:rPr>
-              <w:t>44.76</w:t>
+              <w:t>48.37</w:t>
             </w:r>
           </w:p>
         </w:tc>
@@ -3531,7 +3531,7 @@
                 <w:sz w:val="24"/>
                 <w:szCs w:val="24"/>
               </w:rPr>
-              <w:t>97.44</w:t>
+              <w:t>106.77</w:t>
             </w:r>
           </w:p>
         </w:tc>
@@ -3554,7 +3554,7 @@
                 <w:sz w:val="24"/>
                 <w:szCs w:val="24"/>
               </w:rPr>
-              <w:t>4.0282e+05</w:t>
+              <w:t>4.3533e+05</w:t>
             </w:r>
           </w:p>
         </w:tc>
@@ -3577,7 +3577,7 @@
                 <w:sz w:val="24"/>
                 <w:szCs w:val="24"/>
               </w:rPr>
-              <w:t>35.66</w:t>
+              <w:t>38.22</w:t>
             </w:r>
           </w:p>
         </w:tc>
@@ -3600,7 +3600,7 @@
                 <w:sz w:val="24"/>
                 <w:szCs w:val="24"/>
               </w:rPr>
-              <w:t>79.43</w:t>
+              <w:t>85.64</w:t>
             </w:r>
           </w:p>
         </w:tc>
@@ -3623,7 +3623,7 @@
                 <w:sz w:val="24"/>
                 <w:szCs w:val="24"/>
               </w:rPr>
-              <w:t>3.2092e+05</w:t>
+              <w:t>3.4398e+05</w:t>
             </w:r>
           </w:p>
         </w:tc>
@@ -3696,7 +3696,7 @@
                 <w:sz w:val="24"/>
                 <w:szCs w:val="24"/>
               </w:rPr>
-              <w:t>44.15</w:t>
+              <w:t>43.33</w:t>
             </w:r>
           </w:p>
         </w:tc>
@@ -3719,7 +3719,7 @@
                 <w:sz w:val="24"/>
                 <w:szCs w:val="24"/>
               </w:rPr>
-              <w:t>117.42</w:t>
+              <w:t>117.38</w:t>
             </w:r>
           </w:p>
         </w:tc>
@@ -3742,7 +3742,7 @@
                 <w:sz w:val="24"/>
                 <w:szCs w:val="24"/>
               </w:rPr>
-              <w:t>3.9731e+05</w:t>
+              <w:t>3.8993e+05</w:t>
             </w:r>
           </w:p>
         </w:tc>
@@ -3765,7 +3765,7 @@
                 <w:sz w:val="24"/>
                 <w:szCs w:val="24"/>
               </w:rPr>
-              <w:t>41.84</w:t>
+              <w:t>41.67</w:t>
             </w:r>
           </w:p>
         </w:tc>
@@ -3788,7 +3788,7 @@
                 <w:sz w:val="24"/>
                 <w:szCs w:val="24"/>
               </w:rPr>
-              <w:t>130.77</w:t>
+              <w:t>130.78</w:t>
             </w:r>
           </w:p>
         </w:tc>
@@ -3811,7 +3811,7 @@
                 <w:sz w:val="24"/>
                 <w:szCs w:val="24"/>
               </w:rPr>
-              <w:t>3.7655e+05</w:t>
+              <w:t>3.7505e+05</w:t>
             </w:r>
           </w:p>
         </w:tc>
@@ -3906,13 +3906,14 @@
         <w:tblLook w:val="04A0" w:firstRow="1" w:lastRow="0" w:firstColumn="1" w:lastColumn="0" w:noHBand="0" w:noVBand="1"/>
       </w:tblPr>
       <w:tblGrid>
-        <w:gridCol w:w="1195"/>
-        <w:gridCol w:w="1165"/>
-        <w:gridCol w:w="1165"/>
-        <w:gridCol w:w="1165"/>
-        <w:gridCol w:w="1165"/>
-        <w:gridCol w:w="1165"/>
-        <w:gridCol w:w="1165"/>
+        <w:gridCol w:w="1176"/>
+        <w:gridCol w:w="1112"/>
+        <w:gridCol w:w="1103"/>
+        <w:gridCol w:w="1316"/>
+        <w:gridCol w:w="1112"/>
+        <w:gridCol w:w="1103"/>
+        <w:gridCol w:w="1316"/>
+        <w:gridCol w:w="1112"/>
       </w:tblGrid>
       <w:tr>
         <w:trPr>
@@ -3920,7 +3921,7 @@
         </w:trPr>
         <w:tc>
           <w:tcPr>
-            <w:tcW w:w="1195" w:type="dxa"/>
+            <w:tcW w:w="1176" w:type="dxa"/>
           </w:tcPr>
           <w:p>
             <w:pPr>
@@ -3942,7 +3943,7 @@
         </w:tc>
         <w:tc>
           <w:tcPr>
-            <w:tcW w:w="1165" w:type="dxa"/>
+            <w:tcW w:w="1112" w:type="dxa"/>
           </w:tcPr>
           <w:p>
             <w:pPr>
@@ -3983,7 +3984,7 @@
         </w:tc>
         <w:tc>
           <w:tcPr>
-            <w:tcW w:w="1165" w:type="dxa"/>
+            <w:tcW w:w="1103" w:type="dxa"/>
           </w:tcPr>
           <w:p>
             <w:pPr>
@@ -4006,22 +4007,48 @@
         </w:tc>
         <w:tc>
           <w:tcPr>
-            <w:tcW w:w="1165" w:type="dxa"/>
-          </w:tcPr>
-          <w:p>
-            <w:pPr>
-              <w:jc w:val="center"/>
-              <w:rPr>
-                <w:rFonts w:ascii="Garamond" w:hAnsi="Garamond"/>
-                <w:sz w:val="24"/>
-                <w:szCs w:val="24"/>
-              </w:rPr>
-            </w:pPr>
-          </w:p>
-        </w:tc>
-        <w:tc>
-          <w:tcPr>
-            <w:tcW w:w="1165" w:type="dxa"/>
+            <w:tcW w:w="1316" w:type="dxa"/>
+          </w:tcPr>
+          <w:p>
+            <w:pPr>
+              <w:jc w:val="center"/>
+              <w:rPr>
+                <w:rFonts w:ascii="Garamond" w:hAnsi="Garamond"/>
+                <w:sz w:val="24"/>
+                <w:szCs w:val="24"/>
+              </w:rPr>
+            </w:pPr>
+            <w:r>
+              <w:rPr>
+                <w:rFonts w:ascii="Garamond" w:hAnsi="Garamond"/>
+                <w:sz w:val="24"/>
+                <w:szCs w:val="24"/>
+              </w:rPr>
+              <w:t>70 kHz biomass</w:t>
+            </w:r>
+          </w:p>
+          <w:p>
+            <w:pPr>
+              <w:jc w:val="center"/>
+              <w:rPr>
+                <w:rFonts w:ascii="Garamond" w:hAnsi="Garamond"/>
+                <w:sz w:val="24"/>
+                <w:szCs w:val="24"/>
+              </w:rPr>
+            </w:pPr>
+            <w:r>
+              <w:rPr>
+                <w:rFonts w:ascii="Garamond" w:hAnsi="Garamond"/>
+                <w:sz w:val="24"/>
+                <w:szCs w:val="24"/>
+              </w:rPr>
+              <w:t>(tons)</w:t>
+            </w:r>
+          </w:p>
+        </w:tc>
+        <w:tc>
+          <w:tcPr>
+            <w:tcW w:w="1112" w:type="dxa"/>
           </w:tcPr>
           <w:p>
             <w:pPr>
@@ -4062,7 +4089,7 @@
         </w:tc>
         <w:tc>
           <w:tcPr>
-            <w:tcW w:w="1165" w:type="dxa"/>
+            <w:tcW w:w="1103" w:type="dxa"/>
           </w:tcPr>
           <w:p>
             <w:pPr>
@@ -4085,42 +4112,65 @@
         </w:tc>
         <w:tc>
           <w:tcPr>
-            <w:tcW w:w="1165" w:type="dxa"/>
-          </w:tcPr>
-          <w:p>
-            <w:pPr>
-              <w:jc w:val="center"/>
-              <w:rPr>
-                <w:rFonts w:ascii="Garamond" w:hAnsi="Garamond"/>
-                <w:sz w:val="24"/>
-                <w:szCs w:val="24"/>
-              </w:rPr>
-            </w:pPr>
-            <w:r>
-              <w:rPr>
-                <w:rFonts w:ascii="Garamond" w:hAnsi="Garamond"/>
-                <w:sz w:val="24"/>
-                <w:szCs w:val="24"/>
-              </w:rPr>
-              <w:t>120 kHz</w:t>
-            </w:r>
-          </w:p>
-          <w:p>
-            <w:pPr>
-              <w:jc w:val="center"/>
-              <w:rPr>
-                <w:rFonts w:ascii="Garamond" w:hAnsi="Garamond"/>
-                <w:sz w:val="24"/>
-                <w:szCs w:val="24"/>
-              </w:rPr>
-            </w:pPr>
-            <w:r>
-              <w:rPr>
-                <w:rFonts w:ascii="Garamond" w:hAnsi="Garamond"/>
-                <w:sz w:val="24"/>
-                <w:szCs w:val="24"/>
-              </w:rPr>
-              <w:t>school count</w:t>
+            <w:tcW w:w="1316" w:type="dxa"/>
+          </w:tcPr>
+          <w:p>
+            <w:pPr>
+              <w:jc w:val="center"/>
+              <w:rPr>
+                <w:rFonts w:ascii="Garamond" w:hAnsi="Garamond"/>
+                <w:sz w:val="24"/>
+                <w:szCs w:val="24"/>
+              </w:rPr>
+            </w:pPr>
+            <w:r>
+              <w:rPr>
+                <w:rFonts w:ascii="Garamond" w:hAnsi="Garamond"/>
+                <w:sz w:val="24"/>
+                <w:szCs w:val="24"/>
+              </w:rPr>
+              <w:t>120 kHz biomass</w:t>
+            </w:r>
+          </w:p>
+          <w:p>
+            <w:pPr>
+              <w:jc w:val="center"/>
+              <w:rPr>
+                <w:rFonts w:ascii="Garamond" w:hAnsi="Garamond"/>
+                <w:sz w:val="24"/>
+                <w:szCs w:val="24"/>
+              </w:rPr>
+            </w:pPr>
+            <w:r>
+              <w:rPr>
+                <w:rFonts w:ascii="Garamond" w:hAnsi="Garamond"/>
+                <w:sz w:val="24"/>
+                <w:szCs w:val="24"/>
+              </w:rPr>
+              <w:t>(tons)</w:t>
+            </w:r>
+          </w:p>
+        </w:tc>
+        <w:tc>
+          <w:tcPr>
+            <w:tcW w:w="1112" w:type="dxa"/>
+          </w:tcPr>
+          <w:p>
+            <w:pPr>
+              <w:jc w:val="center"/>
+              <w:rPr>
+                <w:rFonts w:ascii="Garamond" w:hAnsi="Garamond"/>
+                <w:sz w:val="24"/>
+                <w:szCs w:val="24"/>
+              </w:rPr>
+            </w:pPr>
+            <w:r>
+              <w:rPr>
+                <w:rFonts w:ascii="Garamond" w:hAnsi="Garamond"/>
+                <w:sz w:val="24"/>
+                <w:szCs w:val="24"/>
+              </w:rPr>
+              <w:t>Number of schools</w:t>
             </w:r>
           </w:p>
         </w:tc>
@@ -4131,7 +4181,7 @@
         </w:trPr>
         <w:tc>
           <w:tcPr>
-            <w:tcW w:w="1195" w:type="dxa"/>
+            <w:tcW w:w="1176" w:type="dxa"/>
           </w:tcPr>
           <w:p>
             <w:pPr>
@@ -4153,140 +4203,155 @@
         </w:tc>
         <w:tc>
           <w:tcPr>
-            <w:tcW w:w="1165" w:type="dxa"/>
-          </w:tcPr>
-          <w:p>
-            <w:pPr>
-              <w:jc w:val="center"/>
-              <w:rPr>
-                <w:rFonts w:ascii="Garamond" w:hAnsi="Garamond"/>
-                <w:sz w:val="24"/>
-                <w:szCs w:val="24"/>
-              </w:rPr>
-            </w:pPr>
-            <w:r>
-              <w:rPr>
-                <w:rFonts w:ascii="Garamond" w:hAnsi="Garamond"/>
-                <w:sz w:val="24"/>
-                <w:szCs w:val="24"/>
-              </w:rPr>
-              <w:t>39.04</w:t>
-            </w:r>
-          </w:p>
-        </w:tc>
-        <w:tc>
-          <w:tcPr>
-            <w:tcW w:w="1165" w:type="dxa"/>
-          </w:tcPr>
-          <w:p>
-            <w:pPr>
-              <w:jc w:val="center"/>
-              <w:rPr>
-                <w:rFonts w:ascii="Garamond" w:hAnsi="Garamond"/>
-                <w:sz w:val="24"/>
-                <w:szCs w:val="24"/>
-              </w:rPr>
-            </w:pPr>
-            <w:r>
-              <w:rPr>
-                <w:rFonts w:ascii="Garamond" w:hAnsi="Garamond"/>
-                <w:sz w:val="24"/>
-                <w:szCs w:val="24"/>
-              </w:rPr>
-              <w:t>92.16</w:t>
-            </w:r>
-          </w:p>
-        </w:tc>
-        <w:tc>
-          <w:tcPr>
-            <w:tcW w:w="1165" w:type="dxa"/>
-          </w:tcPr>
-          <w:p>
-            <w:pPr>
-              <w:jc w:val="center"/>
-              <w:rPr>
-                <w:rFonts w:ascii="Garamond" w:hAnsi="Garamond"/>
-                <w:sz w:val="24"/>
-                <w:szCs w:val="24"/>
-              </w:rPr>
-            </w:pPr>
-          </w:p>
-        </w:tc>
-        <w:tc>
-          <w:tcPr>
-            <w:tcW w:w="1165" w:type="dxa"/>
-          </w:tcPr>
-          <w:p>
-            <w:pPr>
-              <w:jc w:val="center"/>
-              <w:rPr>
-                <w:rFonts w:ascii="Garamond" w:hAnsi="Garamond"/>
-                <w:sz w:val="24"/>
-                <w:szCs w:val="24"/>
-              </w:rPr>
-            </w:pPr>
-            <w:r>
-              <w:rPr>
-                <w:rFonts w:ascii="Garamond" w:hAnsi="Garamond"/>
-                <w:sz w:val="24"/>
-                <w:szCs w:val="24"/>
-              </w:rPr>
-              <w:t>31.93</w:t>
-            </w:r>
-          </w:p>
-        </w:tc>
-        <w:tc>
-          <w:tcPr>
-            <w:tcW w:w="1165" w:type="dxa"/>
-          </w:tcPr>
-          <w:p>
-            <w:pPr>
-              <w:jc w:val="center"/>
-              <w:rPr>
-                <w:rFonts w:ascii="Garamond" w:hAnsi="Garamond"/>
-                <w:sz w:val="24"/>
-                <w:szCs w:val="24"/>
-              </w:rPr>
-            </w:pPr>
-            <w:r>
-              <w:rPr>
-                <w:rFonts w:ascii="Garamond" w:hAnsi="Garamond"/>
-                <w:sz w:val="24"/>
-                <w:szCs w:val="24"/>
-              </w:rPr>
-              <w:t>75.24</w:t>
-            </w:r>
-          </w:p>
-        </w:tc>
-        <w:tc>
-          <w:tcPr>
-            <w:tcW w:w="1165" w:type="dxa"/>
-          </w:tcPr>
-          <w:p>
-            <w:pPr>
-              <w:jc w:val="center"/>
-              <w:rPr>
-                <w:rFonts w:ascii="Garamond" w:hAnsi="Garamond"/>
-                <w:sz w:val="24"/>
-                <w:szCs w:val="24"/>
-              </w:rPr>
-            </w:pPr>
-            <w:r>
-              <w:rPr>
-                <w:rFonts w:ascii="Garamond" w:hAnsi="Garamond"/>
-                <w:sz w:val="24"/>
-                <w:szCs w:val="24"/>
-              </w:rPr>
-              <w:t>7</w:t>
-            </w:r>
-            <w:r>
-              <w:rPr>
-                <w:rFonts w:ascii="Garamond" w:hAnsi="Garamond"/>
-                <w:sz w:val="24"/>
-                <w:szCs w:val="24"/>
-              </w:rPr>
-              <w:t>10</w:t>
-            </w:r>
+            <w:tcW w:w="1112" w:type="dxa"/>
+          </w:tcPr>
+          <w:p>
+            <w:pPr>
+              <w:jc w:val="center"/>
+              <w:rPr>
+                <w:rFonts w:ascii="Garamond" w:hAnsi="Garamond"/>
+                <w:sz w:val="24"/>
+                <w:szCs w:val="24"/>
+              </w:rPr>
+            </w:pPr>
+            <w:r>
+              <w:rPr>
+                <w:rFonts w:ascii="Garamond" w:hAnsi="Garamond"/>
+                <w:sz w:val="24"/>
+                <w:szCs w:val="24"/>
+              </w:rPr>
+              <w:t>41.89</w:t>
+            </w:r>
+          </w:p>
+        </w:tc>
+        <w:tc>
+          <w:tcPr>
+            <w:tcW w:w="1103" w:type="dxa"/>
+          </w:tcPr>
+          <w:p>
+            <w:pPr>
+              <w:jc w:val="center"/>
+              <w:rPr>
+                <w:rFonts w:ascii="Garamond" w:hAnsi="Garamond"/>
+                <w:sz w:val="24"/>
+                <w:szCs w:val="24"/>
+              </w:rPr>
+            </w:pPr>
+            <w:r>
+              <w:rPr>
+                <w:rFonts w:ascii="Garamond" w:hAnsi="Garamond"/>
+                <w:sz w:val="24"/>
+                <w:szCs w:val="24"/>
+              </w:rPr>
+              <w:t>99.28</w:t>
+            </w:r>
+          </w:p>
+        </w:tc>
+        <w:tc>
+          <w:tcPr>
+            <w:tcW w:w="1316" w:type="dxa"/>
+          </w:tcPr>
+          <w:p>
+            <w:pPr>
+              <w:jc w:val="center"/>
+              <w:rPr>
+                <w:rFonts w:ascii="Garamond" w:hAnsi="Garamond"/>
+                <w:sz w:val="24"/>
+                <w:szCs w:val="24"/>
+              </w:rPr>
+            </w:pPr>
+            <w:r>
+              <w:rPr>
+                <w:rFonts w:ascii="Garamond" w:hAnsi="Garamond"/>
+                <w:sz w:val="24"/>
+                <w:szCs w:val="24"/>
+              </w:rPr>
+              <w:t>3.7704e+05</w:t>
+            </w:r>
+          </w:p>
+        </w:tc>
+        <w:tc>
+          <w:tcPr>
+            <w:tcW w:w="1112" w:type="dxa"/>
+          </w:tcPr>
+          <w:p>
+            <w:pPr>
+              <w:jc w:val="center"/>
+              <w:rPr>
+                <w:rFonts w:ascii="Garamond" w:hAnsi="Garamond"/>
+                <w:sz w:val="24"/>
+                <w:szCs w:val="24"/>
+              </w:rPr>
+            </w:pPr>
+            <w:r>
+              <w:rPr>
+                <w:rFonts w:ascii="Garamond" w:hAnsi="Garamond"/>
+                <w:sz w:val="24"/>
+                <w:szCs w:val="24"/>
+              </w:rPr>
+              <w:t>33.91</w:t>
+            </w:r>
+          </w:p>
+        </w:tc>
+        <w:tc>
+          <w:tcPr>
+            <w:tcW w:w="1103" w:type="dxa"/>
+          </w:tcPr>
+          <w:p>
+            <w:pPr>
+              <w:jc w:val="center"/>
+              <w:rPr>
+                <w:rFonts w:ascii="Garamond" w:hAnsi="Garamond"/>
+                <w:sz w:val="24"/>
+                <w:szCs w:val="24"/>
+              </w:rPr>
+            </w:pPr>
+            <w:r>
+              <w:rPr>
+                <w:rFonts w:ascii="Garamond" w:hAnsi="Garamond"/>
+                <w:sz w:val="24"/>
+                <w:szCs w:val="24"/>
+              </w:rPr>
+              <w:t>78.77</w:t>
+            </w:r>
+          </w:p>
+        </w:tc>
+        <w:tc>
+          <w:tcPr>
+            <w:tcW w:w="1316" w:type="dxa"/>
+          </w:tcPr>
+          <w:p>
+            <w:pPr>
+              <w:jc w:val="center"/>
+              <w:rPr>
+                <w:rFonts w:ascii="Garamond" w:hAnsi="Garamond"/>
+                <w:sz w:val="24"/>
+                <w:szCs w:val="24"/>
+              </w:rPr>
+            </w:pPr>
+            <w:r>
+              <w:rPr>
+                <w:rFonts w:ascii="Garamond" w:hAnsi="Garamond"/>
+                <w:sz w:val="24"/>
+                <w:szCs w:val="24"/>
+              </w:rPr>
+              <w:t>3.0515e+05</w:t>
+            </w:r>
+          </w:p>
+        </w:tc>
+        <w:tc>
+          <w:tcPr>
+            <w:tcW w:w="1112" w:type="dxa"/>
+          </w:tcPr>
+          <w:p>
+            <w:pPr>
+              <w:jc w:val="center"/>
+              <w:rPr>
+                <w:rFonts w:ascii="Garamond" w:hAnsi="Garamond"/>
+                <w:sz w:val="24"/>
+                <w:szCs w:val="24"/>
+              </w:rPr>
+            </w:pPr>
           </w:p>
         </w:tc>
       </w:tr>
@@ -4296,7 +4361,7 @@
         </w:trPr>
         <w:tc>
           <w:tcPr>
-            <w:tcW w:w="1195" w:type="dxa"/>
+            <w:tcW w:w="1176" w:type="dxa"/>
           </w:tcPr>
           <w:p>
             <w:pPr>
@@ -4318,132 +4383,155 @@
         </w:tc>
         <w:tc>
           <w:tcPr>
-            <w:tcW w:w="1165" w:type="dxa"/>
-          </w:tcPr>
-          <w:p>
-            <w:pPr>
-              <w:jc w:val="center"/>
-              <w:rPr>
-                <w:rFonts w:ascii="Garamond" w:hAnsi="Garamond"/>
-                <w:sz w:val="24"/>
-                <w:szCs w:val="24"/>
-              </w:rPr>
-            </w:pPr>
-            <w:r>
-              <w:rPr>
-                <w:rFonts w:ascii="Garamond" w:hAnsi="Garamond"/>
-                <w:sz w:val="24"/>
-                <w:szCs w:val="24"/>
-              </w:rPr>
-              <w:t>37.54</w:t>
-            </w:r>
-          </w:p>
-        </w:tc>
-        <w:tc>
-          <w:tcPr>
-            <w:tcW w:w="1165" w:type="dxa"/>
-          </w:tcPr>
-          <w:p>
-            <w:pPr>
-              <w:jc w:val="center"/>
-              <w:rPr>
-                <w:rFonts w:ascii="Garamond" w:hAnsi="Garamond"/>
-                <w:sz w:val="24"/>
-                <w:szCs w:val="24"/>
-              </w:rPr>
-            </w:pPr>
-            <w:r>
-              <w:rPr>
-                <w:rFonts w:ascii="Garamond" w:hAnsi="Garamond"/>
-                <w:sz w:val="24"/>
-                <w:szCs w:val="24"/>
-              </w:rPr>
-              <w:t>103.20</w:t>
-            </w:r>
-          </w:p>
-        </w:tc>
-        <w:tc>
-          <w:tcPr>
-            <w:tcW w:w="1165" w:type="dxa"/>
-          </w:tcPr>
-          <w:p>
-            <w:pPr>
-              <w:jc w:val="center"/>
-              <w:rPr>
-                <w:rFonts w:ascii="Garamond" w:hAnsi="Garamond"/>
-                <w:sz w:val="24"/>
-                <w:szCs w:val="24"/>
-              </w:rPr>
-            </w:pPr>
-          </w:p>
-        </w:tc>
-        <w:tc>
-          <w:tcPr>
-            <w:tcW w:w="1165" w:type="dxa"/>
-          </w:tcPr>
-          <w:p>
-            <w:pPr>
-              <w:jc w:val="center"/>
-              <w:rPr>
-                <w:rFonts w:ascii="Garamond" w:hAnsi="Garamond"/>
-                <w:sz w:val="24"/>
-                <w:szCs w:val="24"/>
-              </w:rPr>
-            </w:pPr>
-            <w:r>
-              <w:rPr>
-                <w:rFonts w:ascii="Garamond" w:hAnsi="Garamond"/>
-                <w:sz w:val="24"/>
-                <w:szCs w:val="24"/>
-              </w:rPr>
-              <w:t>34.95</w:t>
-            </w:r>
-          </w:p>
-        </w:tc>
-        <w:tc>
-          <w:tcPr>
-            <w:tcW w:w="1165" w:type="dxa"/>
-          </w:tcPr>
-          <w:p>
-            <w:pPr>
-              <w:jc w:val="center"/>
-              <w:rPr>
-                <w:rFonts w:ascii="Garamond" w:hAnsi="Garamond"/>
-                <w:sz w:val="24"/>
-                <w:szCs w:val="24"/>
-              </w:rPr>
-            </w:pPr>
-            <w:r>
-              <w:rPr>
-                <w:rFonts w:ascii="Garamond" w:hAnsi="Garamond"/>
-                <w:sz w:val="24"/>
-                <w:szCs w:val="24"/>
-              </w:rPr>
-              <w:t>99.71</w:t>
-            </w:r>
-          </w:p>
-        </w:tc>
-        <w:tc>
-          <w:tcPr>
-            <w:tcW w:w="1165" w:type="dxa"/>
-          </w:tcPr>
-          <w:p>
-            <w:pPr>
-              <w:jc w:val="center"/>
-              <w:rPr>
-                <w:rFonts w:ascii="Garamond" w:hAnsi="Garamond"/>
-                <w:sz w:val="24"/>
-                <w:szCs w:val="24"/>
-              </w:rPr>
-            </w:pPr>
-            <w:r>
-              <w:rPr>
-                <w:rFonts w:ascii="Garamond" w:hAnsi="Garamond"/>
-                <w:sz w:val="24"/>
-                <w:szCs w:val="24"/>
-              </w:rPr>
-              <w:t>582</w:t>
-            </w:r>
+            <w:tcW w:w="1112" w:type="dxa"/>
+          </w:tcPr>
+          <w:p>
+            <w:pPr>
+              <w:jc w:val="center"/>
+              <w:rPr>
+                <w:rFonts w:ascii="Garamond" w:hAnsi="Garamond"/>
+                <w:sz w:val="24"/>
+                <w:szCs w:val="24"/>
+              </w:rPr>
+            </w:pPr>
+            <w:r>
+              <w:rPr>
+                <w:rFonts w:ascii="Garamond" w:hAnsi="Garamond"/>
+                <w:sz w:val="24"/>
+                <w:szCs w:val="24"/>
+              </w:rPr>
+              <w:t>37.62</w:t>
+            </w:r>
+          </w:p>
+        </w:tc>
+        <w:tc>
+          <w:tcPr>
+            <w:tcW w:w="1103" w:type="dxa"/>
+          </w:tcPr>
+          <w:p>
+            <w:pPr>
+              <w:jc w:val="center"/>
+              <w:rPr>
+                <w:rFonts w:ascii="Garamond" w:hAnsi="Garamond"/>
+                <w:sz w:val="24"/>
+                <w:szCs w:val="24"/>
+              </w:rPr>
+            </w:pPr>
+            <w:r>
+              <w:rPr>
+                <w:rFonts w:ascii="Garamond" w:hAnsi="Garamond"/>
+                <w:sz w:val="24"/>
+                <w:szCs w:val="24"/>
+              </w:rPr>
+              <w:t>103.22</w:t>
+            </w:r>
+          </w:p>
+        </w:tc>
+        <w:tc>
+          <w:tcPr>
+            <w:tcW w:w="1316" w:type="dxa"/>
+          </w:tcPr>
+          <w:p>
+            <w:pPr>
+              <w:jc w:val="center"/>
+              <w:rPr>
+                <w:rFonts w:ascii="Garamond" w:hAnsi="Garamond"/>
+                <w:sz w:val="24"/>
+                <w:szCs w:val="24"/>
+              </w:rPr>
+            </w:pPr>
+            <w:r>
+              <w:rPr>
+                <w:rFonts w:ascii="Garamond" w:hAnsi="Garamond"/>
+                <w:sz w:val="24"/>
+                <w:szCs w:val="24"/>
+              </w:rPr>
+              <w:t>3.3855e+05</w:t>
+            </w:r>
+          </w:p>
+        </w:tc>
+        <w:tc>
+          <w:tcPr>
+            <w:tcW w:w="1112" w:type="dxa"/>
+          </w:tcPr>
+          <w:p>
+            <w:pPr>
+              <w:jc w:val="center"/>
+              <w:rPr>
+                <w:rFonts w:ascii="Garamond" w:hAnsi="Garamond"/>
+                <w:sz w:val="24"/>
+                <w:szCs w:val="24"/>
+              </w:rPr>
+            </w:pPr>
+            <w:r>
+              <w:rPr>
+                <w:rFonts w:ascii="Garamond" w:hAnsi="Garamond"/>
+                <w:sz w:val="24"/>
+                <w:szCs w:val="24"/>
+              </w:rPr>
+              <w:t>35.01</w:t>
+            </w:r>
+          </w:p>
+        </w:tc>
+        <w:tc>
+          <w:tcPr>
+            <w:tcW w:w="1103" w:type="dxa"/>
+          </w:tcPr>
+          <w:p>
+            <w:pPr>
+              <w:jc w:val="center"/>
+              <w:rPr>
+                <w:rFonts w:ascii="Garamond" w:hAnsi="Garamond"/>
+                <w:sz w:val="24"/>
+                <w:szCs w:val="24"/>
+              </w:rPr>
+            </w:pPr>
+            <w:r>
+              <w:rPr>
+                <w:rFonts w:ascii="Garamond" w:hAnsi="Garamond"/>
+                <w:sz w:val="24"/>
+                <w:szCs w:val="24"/>
+              </w:rPr>
+              <w:t>99.72</w:t>
+            </w:r>
+          </w:p>
+        </w:tc>
+        <w:tc>
+          <w:tcPr>
+            <w:tcW w:w="1316" w:type="dxa"/>
+          </w:tcPr>
+          <w:p>
+            <w:pPr>
+              <w:jc w:val="center"/>
+              <w:rPr>
+                <w:rFonts w:ascii="Garamond" w:hAnsi="Garamond"/>
+                <w:sz w:val="24"/>
+                <w:szCs w:val="24"/>
+              </w:rPr>
+            </w:pPr>
+            <w:r>
+              <w:rPr>
+                <w:rFonts w:ascii="Garamond" w:hAnsi="Garamond"/>
+                <w:sz w:val="24"/>
+                <w:szCs w:val="24"/>
+              </w:rPr>
+              <w:t>3.1508e+05</w:t>
+            </w:r>
+          </w:p>
+        </w:tc>
+        <w:tc>
+          <w:tcPr>
+            <w:tcW w:w="1112" w:type="dxa"/>
+          </w:tcPr>
+          <w:p>
+            <w:pPr>
+              <w:jc w:val="center"/>
+              <w:rPr>
+                <w:rFonts w:ascii="Garamond" w:hAnsi="Garamond"/>
+                <w:sz w:val="24"/>
+                <w:szCs w:val="24"/>
+              </w:rPr>
+            </w:pPr>
           </w:p>
         </w:tc>
       </w:tr>
@@ -5543,7 +5631,7 @@
                 <w:sz w:val="24"/>
                 <w:szCs w:val="24"/>
               </w:rPr>
-              <w:t>56.13</w:t>
+              <w:t>59.16</w:t>
             </w:r>
           </w:p>
         </w:tc>
@@ -5566,7 +5654,7 @@
                 <w:sz w:val="24"/>
                 <w:szCs w:val="24"/>
               </w:rPr>
-              <w:t>43.01</w:t>
+              <w:t>43.52</w:t>
             </w:r>
           </w:p>
         </w:tc>
@@ -5590,7 +5678,7 @@
                 <w:sz w:val="24"/>
                 <w:szCs w:val="24"/>
               </w:rPr>
-              <w:t>90.61</w:t>
+              <w:t>89.97</w:t>
             </w:r>
           </w:p>
         </w:tc>
@@ -5614,7 +5702,7 @@
                 <w:sz w:val="24"/>
                 <w:szCs w:val="24"/>
               </w:rPr>
-              <w:t>44.29</w:t>
+              <w:t>47.79</w:t>
             </w:r>
           </w:p>
         </w:tc>
@@ -5637,7 +5725,7 @@
                 <w:sz w:val="24"/>
                 <w:szCs w:val="24"/>
               </w:rPr>
-              <w:t>32.03</w:t>
+              <w:t>34.46</w:t>
             </w:r>
           </w:p>
         </w:tc>
@@ -5661,7 +5749,7 @@
                 <w:sz w:val="24"/>
                 <w:szCs w:val="24"/>
               </w:rPr>
-              <w:t>70.17</w:t>
+              <w:t>71.69</w:t>
             </w:r>
           </w:p>
         </w:tc>
@@ -5738,7 +5826,7 @@
                 <w:sz w:val="24"/>
                 <w:szCs w:val="24"/>
               </w:rPr>
-              <w:t>49.32</w:t>
+              <w:t>48.87</w:t>
             </w:r>
           </w:p>
         </w:tc>
@@ -5761,7 +5849,7 @@
                 <w:sz w:val="24"/>
                 <w:szCs w:val="24"/>
               </w:rPr>
-              <w:t>31.97</w:t>
+              <w:t>30.60</w:t>
             </w:r>
           </w:p>
         </w:tc>
@@ -5785,7 +5873,7 @@
                 <w:sz w:val="24"/>
                 <w:szCs w:val="24"/>
               </w:rPr>
-              <w:t>97.67</w:t>
+              <w:t>111.50</w:t>
             </w:r>
           </w:p>
         </w:tc>
@@ -5809,7 +5897,7 @@
                 <w:sz w:val="24"/>
                 <w:szCs w:val="24"/>
               </w:rPr>
-              <w:t>48.91</w:t>
+              <w:t>49.16</w:t>
             </w:r>
           </w:p>
         </w:tc>
@@ -5832,7 +5920,7 @@
                 <w:sz w:val="24"/>
                 <w:szCs w:val="24"/>
               </w:rPr>
-              <w:t>29.90</w:t>
+              <w:t>29.32</w:t>
             </w:r>
           </w:p>
         </w:tc>
@@ -5856,7 +5944,7 @@
                 <w:sz w:val="24"/>
                 <w:szCs w:val="24"/>
               </w:rPr>
-              <w:t>125.47</w:t>
+              <w:t>114.65</w:t>
             </w:r>
           </w:p>
         </w:tc>
@@ -5880,342 +5968,6 @@
                 <w:szCs w:val="24"/>
               </w:rPr>
               <w:t>72</w:t>
-            </w:r>
-          </w:p>
-        </w:tc>
-      </w:tr>
-    </w:tbl>
-    <w:p/>
-    <w:p/>
-    <w:p/>
-    <w:p>
-      <w:pPr>
-        <w:rPr>
-          <w:rFonts w:ascii="Garamond" w:hAnsi="Garamond"/>
-          <w:sz w:val="24"/>
-          <w:szCs w:val="24"/>
-        </w:rPr>
-      </w:pPr>
-      <w:r>
-        <w:rPr>
-          <w:rFonts w:ascii="Garamond" w:hAnsi="Garamond"/>
-          <w:sz w:val="24"/>
-          <w:szCs w:val="24"/>
-        </w:rPr>
-        <w:t xml:space="preserve">Table </w:t>
-      </w:r>
-      <w:r>
-        <w:rPr>
-          <w:rFonts w:ascii="Garamond" w:hAnsi="Garamond"/>
-          <w:sz w:val="24"/>
-          <w:szCs w:val="24"/>
-        </w:rPr>
-        <w:t>6</w:t>
-      </w:r>
-      <w:r>
-        <w:rPr>
-          <w:rFonts w:ascii="Garamond" w:hAnsi="Garamond"/>
-          <w:sz w:val="24"/>
-          <w:szCs w:val="24"/>
-        </w:rPr>
-        <w:t>. Table of bootstrapped densities with lower and upper confidence intervals and the number of binned data samples</w:t>
-      </w:r>
-      <w:r>
-        <w:rPr>
-          <w:rFonts w:ascii="Garamond" w:hAnsi="Garamond"/>
-          <w:sz w:val="24"/>
-          <w:szCs w:val="24"/>
-        </w:rPr>
-        <w:t xml:space="preserve"> for the </w:t>
-      </w:r>
-      <w:proofErr w:type="gramStart"/>
-      <w:r>
-        <w:rPr>
-          <w:rFonts w:ascii="Garamond" w:hAnsi="Garamond"/>
-          <w:sz w:val="24"/>
-          <w:szCs w:val="24"/>
-        </w:rPr>
-        <w:t>schools</w:t>
-      </w:r>
-      <w:proofErr w:type="gramEnd"/>
-      <w:r>
-        <w:rPr>
-          <w:rFonts w:ascii="Garamond" w:hAnsi="Garamond"/>
-          <w:sz w:val="24"/>
-          <w:szCs w:val="24"/>
-        </w:rPr>
-        <w:t xml:space="preserve"> survey</w:t>
-      </w:r>
-      <w:r>
-        <w:rPr>
-          <w:rFonts w:ascii="Garamond" w:hAnsi="Garamond"/>
-          <w:sz w:val="24"/>
-          <w:szCs w:val="24"/>
-        </w:rPr>
-        <w:t xml:space="preserve"> area</w:t>
-      </w:r>
-      <w:r>
-        <w:rPr>
-          <w:rFonts w:ascii="Garamond" w:hAnsi="Garamond"/>
-          <w:sz w:val="24"/>
-          <w:szCs w:val="24"/>
-        </w:rPr>
-        <w:t>.</w:t>
-      </w:r>
-      <w:r>
-        <w:rPr>
-          <w:rFonts w:ascii="Garamond" w:hAnsi="Garamond"/>
-          <w:sz w:val="24"/>
-          <w:szCs w:val="24"/>
-        </w:rPr>
-        <w:t xml:space="preserve">  </w:t>
-      </w:r>
-      <w:r>
-        <w:rPr>
-          <w:rFonts w:ascii="Garamond" w:hAnsi="Garamond"/>
-          <w:sz w:val="24"/>
-          <w:szCs w:val="24"/>
-        </w:rPr>
-        <w:t>grid_ll.</w:t>
-      </w:r>
-      <w:r>
-        <w:rPr>
-          <w:rFonts w:ascii="Garamond" w:hAnsi="Garamond"/>
-          <w:sz w:val="24"/>
-          <w:szCs w:val="24"/>
-        </w:rPr>
-        <w:t>2</w:t>
-      </w:r>
-      <w:r>
-        <w:rPr>
-          <w:rFonts w:ascii="Garamond" w:hAnsi="Garamond"/>
-          <w:sz w:val="24"/>
-          <w:szCs w:val="24"/>
-        </w:rPr>
-        <w:t>_lt_.1</w:t>
-      </w:r>
-    </w:p>
-    <w:p>
-      <w:pPr>
-        <w:rPr>
-          <w:rFonts w:ascii="Garamond" w:hAnsi="Garamond"/>
-          <w:sz w:val="24"/>
-          <w:szCs w:val="24"/>
-        </w:rPr>
-      </w:pPr>
-    </w:p>
-    <w:tbl>
-      <w:tblPr>
-        <w:tblStyle w:val="TableGrid"/>
-        <w:tblW w:w="0" w:type="auto"/>
-        <w:jc w:val="center"/>
-        <w:tblLook w:val="04A0" w:firstRow="1" w:lastRow="0" w:firstColumn="1" w:lastColumn="0" w:noHBand="0" w:noVBand="1"/>
-      </w:tblPr>
-      <w:tblGrid>
-        <w:gridCol w:w="1594"/>
-        <w:gridCol w:w="1200"/>
-        <w:gridCol w:w="1200"/>
-        <w:gridCol w:w="1200"/>
-        <w:gridCol w:w="1200"/>
-        <w:gridCol w:w="960"/>
-        <w:gridCol w:w="960"/>
-        <w:gridCol w:w="1007"/>
-      </w:tblGrid>
-      <w:tr>
-        <w:trPr>
-          <w:trHeight w:val="288"/>
-          <w:jc w:val="center"/>
-        </w:trPr>
-        <w:tc>
-          <w:tcPr>
-            <w:tcW w:w="1594" w:type="dxa"/>
-            <w:noWrap/>
-            <w:hideMark/>
-          </w:tcPr>
-          <w:p>
-            <w:pPr>
-              <w:rPr>
-                <w:rFonts w:ascii="Garamond" w:hAnsi="Garamond"/>
-                <w:sz w:val="24"/>
-                <w:szCs w:val="24"/>
-              </w:rPr>
-            </w:pPr>
-            <w:r>
-              <w:rPr>
-                <w:rFonts w:ascii="Garamond" w:hAnsi="Garamond"/>
-                <w:sz w:val="24"/>
-                <w:szCs w:val="24"/>
-              </w:rPr>
-              <w:t>Glider</w:t>
-            </w:r>
-          </w:p>
-        </w:tc>
-        <w:tc>
-          <w:tcPr>
-            <w:tcW w:w="1200" w:type="dxa"/>
-            <w:noWrap/>
-            <w:hideMark/>
-          </w:tcPr>
-          <w:p>
-            <w:pPr>
-              <w:jc w:val="center"/>
-              <w:rPr>
-                <w:rFonts w:ascii="Garamond" w:hAnsi="Garamond"/>
-                <w:sz w:val="24"/>
-                <w:szCs w:val="24"/>
-              </w:rPr>
-            </w:pPr>
-            <w:r>
-              <w:rPr>
-                <w:rFonts w:ascii="Garamond" w:hAnsi="Garamond"/>
-                <w:sz w:val="24"/>
-                <w:szCs w:val="24"/>
-              </w:rPr>
-              <w:t>70 kHz density</w:t>
-            </w:r>
-          </w:p>
-        </w:tc>
-        <w:tc>
-          <w:tcPr>
-            <w:tcW w:w="1200" w:type="dxa"/>
-          </w:tcPr>
-          <w:p>
-            <w:pPr>
-              <w:jc w:val="center"/>
-              <w:rPr>
-                <w:rFonts w:ascii="Garamond" w:hAnsi="Garamond"/>
-                <w:sz w:val="24"/>
-                <w:szCs w:val="24"/>
-              </w:rPr>
-            </w:pPr>
-            <w:r>
-              <w:rPr>
-                <w:rFonts w:ascii="Garamond" w:hAnsi="Garamond"/>
-                <w:sz w:val="24"/>
-                <w:szCs w:val="24"/>
-              </w:rPr>
-              <w:t>Lower CI</w:t>
-            </w:r>
-          </w:p>
-        </w:tc>
-        <w:tc>
-          <w:tcPr>
-            <w:tcW w:w="1200" w:type="dxa"/>
-            <w:noWrap/>
-            <w:hideMark/>
-          </w:tcPr>
-          <w:p>
-            <w:pPr>
-              <w:jc w:val="center"/>
-              <w:rPr>
-                <w:rFonts w:ascii="Garamond" w:hAnsi="Garamond"/>
-                <w:sz w:val="24"/>
-                <w:szCs w:val="24"/>
-              </w:rPr>
-            </w:pPr>
-            <w:r>
-              <w:rPr>
-                <w:rFonts w:ascii="Garamond" w:hAnsi="Garamond"/>
-                <w:sz w:val="24"/>
-                <w:szCs w:val="24"/>
-              </w:rPr>
-              <w:t>Upper CI</w:t>
-            </w:r>
-          </w:p>
-        </w:tc>
-        <w:tc>
-          <w:tcPr>
-            <w:tcW w:w="1200" w:type="dxa"/>
-            <w:noWrap/>
-            <w:hideMark/>
-          </w:tcPr>
-          <w:p>
-            <w:pPr>
-              <w:jc w:val="center"/>
-              <w:rPr>
-                <w:rFonts w:ascii="Garamond" w:hAnsi="Garamond"/>
-                <w:sz w:val="24"/>
-                <w:szCs w:val="24"/>
-              </w:rPr>
-            </w:pPr>
-            <w:r>
-              <w:rPr>
-                <w:rFonts w:ascii="Garamond" w:hAnsi="Garamond"/>
-                <w:sz w:val="24"/>
-                <w:szCs w:val="24"/>
-              </w:rPr>
-              <w:t>120 kHz density</w:t>
-            </w:r>
-          </w:p>
-        </w:tc>
-        <w:tc>
-          <w:tcPr>
-            <w:tcW w:w="960" w:type="dxa"/>
-          </w:tcPr>
-          <w:p>
-            <w:pPr>
-              <w:jc w:val="center"/>
-              <w:rPr>
-                <w:rFonts w:ascii="Garamond" w:hAnsi="Garamond"/>
-                <w:sz w:val="24"/>
-                <w:szCs w:val="24"/>
-              </w:rPr>
-            </w:pPr>
-            <w:r>
-              <w:rPr>
-                <w:rFonts w:ascii="Garamond" w:hAnsi="Garamond"/>
-                <w:sz w:val="24"/>
-                <w:szCs w:val="24"/>
-              </w:rPr>
-              <w:t>Lower CI</w:t>
-            </w:r>
-          </w:p>
-        </w:tc>
-        <w:tc>
-          <w:tcPr>
-            <w:tcW w:w="960" w:type="dxa"/>
-            <w:noWrap/>
-            <w:hideMark/>
-          </w:tcPr>
-          <w:p>
-            <w:pPr>
-              <w:jc w:val="center"/>
-              <w:rPr>
-                <w:rFonts w:ascii="Garamond" w:hAnsi="Garamond"/>
-                <w:sz w:val="24"/>
-                <w:szCs w:val="24"/>
-              </w:rPr>
-            </w:pPr>
-            <w:r>
-              <w:rPr>
-                <w:rFonts w:ascii="Garamond" w:hAnsi="Garamond"/>
-                <w:sz w:val="24"/>
-                <w:szCs w:val="24"/>
-              </w:rPr>
-              <w:t>Upper CI</w:t>
-            </w:r>
-          </w:p>
-        </w:tc>
-        <w:tc>
-          <w:tcPr>
-            <w:tcW w:w="960" w:type="dxa"/>
-          </w:tcPr>
-          <w:p>
-            <w:pPr>
-              <w:jc w:val="center"/>
-              <w:rPr>
-                <w:rFonts w:ascii="Garamond" w:hAnsi="Garamond"/>
-                <w:sz w:val="24"/>
-                <w:szCs w:val="24"/>
-              </w:rPr>
-            </w:pPr>
-            <w:r>
-              <w:rPr>
-                <w:rFonts w:ascii="Garamond" w:hAnsi="Garamond"/>
-                <w:sz w:val="24"/>
-                <w:szCs w:val="24"/>
-              </w:rPr>
-              <w:t>Number of samples</w:t>
             </w:r>
           </w:p>
         </w:tc>
@@ -6229,23 +5981,22 @@
           <w:tcPr>
             <w:tcW w:w="1594" w:type="dxa"/>
             <w:noWrap/>
-            <w:hideMark/>
-          </w:tcPr>
-          <w:p>
-            <w:pPr>
-              <w:rPr>
-                <w:rFonts w:ascii="Garamond" w:hAnsi="Garamond"/>
-                <w:sz w:val="24"/>
-                <w:szCs w:val="24"/>
-              </w:rPr>
-            </w:pPr>
-            <w:r>
-              <w:rPr>
-                <w:rFonts w:ascii="Garamond" w:hAnsi="Garamond"/>
-                <w:sz w:val="24"/>
-                <w:szCs w:val="24"/>
-              </w:rPr>
-              <w:t>AMLR03</w:t>
+          </w:tcPr>
+          <w:p>
+            <w:pPr>
+              <w:rPr>
+                <w:rFonts w:ascii="Garamond" w:hAnsi="Garamond"/>
+                <w:sz w:val="24"/>
+                <w:szCs w:val="24"/>
+              </w:rPr>
+            </w:pPr>
+            <w:r>
+              <w:rPr>
+                <w:rFonts w:ascii="Garamond" w:hAnsi="Garamond"/>
+                <w:sz w:val="24"/>
+                <w:szCs w:val="24"/>
+              </w:rPr>
+              <w:t>Schools</w:t>
             </w:r>
           </w:p>
         </w:tc>
@@ -6263,14 +6014,6 @@
                 <w:szCs w:val="24"/>
               </w:rPr>
             </w:pPr>
-            <w:r>
-              <w:rPr>
-                <w:rFonts w:ascii="Garamond" w:hAnsi="Garamond"/>
-                <w:sz w:val="24"/>
-                <w:szCs w:val="24"/>
-              </w:rPr>
-              <w:t>48.40</w:t>
-            </w:r>
           </w:p>
         </w:tc>
         <w:tc>
@@ -6286,14 +6029,6 @@
                 <w:szCs w:val="24"/>
               </w:rPr>
             </w:pPr>
-            <w:r>
-              <w:rPr>
-                <w:rFonts w:ascii="Garamond" w:hAnsi="Garamond"/>
-                <w:sz w:val="24"/>
-                <w:szCs w:val="24"/>
-              </w:rPr>
-              <w:t>33.73</w:t>
-            </w:r>
           </w:p>
         </w:tc>
         <w:tc>
@@ -6310,14 +6045,6 @@
                 <w:szCs w:val="24"/>
               </w:rPr>
             </w:pPr>
-            <w:r>
-              <w:rPr>
-                <w:rFonts w:ascii="Garamond" w:hAnsi="Garamond"/>
-                <w:sz w:val="24"/>
-                <w:szCs w:val="24"/>
-              </w:rPr>
-              <w:t>90.90</w:t>
-            </w:r>
           </w:p>
         </w:tc>
         <w:tc>
@@ -6334,14 +6061,6 @@
                 <w:szCs w:val="24"/>
               </w:rPr>
             </w:pPr>
-            <w:r>
-              <w:rPr>
-                <w:rFonts w:ascii="Garamond" w:hAnsi="Garamond"/>
-                <w:sz w:val="24"/>
-                <w:szCs w:val="24"/>
-              </w:rPr>
-              <w:t>38.87</w:t>
-            </w:r>
           </w:p>
         </w:tc>
         <w:tc>
@@ -6357,14 +6076,6 @@
                 <w:szCs w:val="24"/>
               </w:rPr>
             </w:pPr>
-            <w:r>
-              <w:rPr>
-                <w:rFonts w:ascii="Garamond" w:hAnsi="Garamond"/>
-                <w:sz w:val="24"/>
-                <w:szCs w:val="24"/>
-              </w:rPr>
-              <w:t>27.91</w:t>
-            </w:r>
           </w:p>
         </w:tc>
         <w:tc>
@@ -6381,14 +6092,6 @@
                 <w:szCs w:val="24"/>
               </w:rPr>
             </w:pPr>
-            <w:r>
-              <w:rPr>
-                <w:rFonts w:ascii="Garamond" w:hAnsi="Garamond"/>
-                <w:sz w:val="24"/>
-                <w:szCs w:val="24"/>
-              </w:rPr>
-              <w:t>62.71</w:t>
-            </w:r>
           </w:p>
         </w:tc>
         <w:tc>
@@ -6404,14 +6107,6 @@
                 <w:szCs w:val="24"/>
               </w:rPr>
             </w:pPr>
-            <w:r>
-              <w:rPr>
-                <w:rFonts w:ascii="Garamond" w:hAnsi="Garamond"/>
-                <w:sz w:val="24"/>
-                <w:szCs w:val="24"/>
-              </w:rPr>
-              <w:t>74</w:t>
-            </w:r>
           </w:p>
         </w:tc>
       </w:tr>
@@ -6424,7 +6119,193 @@
           <w:tcPr>
             <w:tcW w:w="1594" w:type="dxa"/>
             <w:noWrap/>
-            <w:hideMark/>
+          </w:tcPr>
+          <w:p>
+            <w:pPr>
+              <w:rPr>
+                <w:rFonts w:ascii="Garamond" w:hAnsi="Garamond"/>
+                <w:sz w:val="24"/>
+                <w:szCs w:val="24"/>
+              </w:rPr>
+            </w:pPr>
+            <w:r>
+              <w:rPr>
+                <w:rFonts w:ascii="Garamond" w:hAnsi="Garamond"/>
+                <w:sz w:val="24"/>
+                <w:szCs w:val="24"/>
+              </w:rPr>
+              <w:lastRenderedPageBreak/>
+              <w:t>AMLR03</w:t>
+            </w:r>
+          </w:p>
+        </w:tc>
+        <w:tc>
+          <w:tcPr>
+            <w:tcW w:w="1200" w:type="dxa"/>
+            <w:noWrap/>
+          </w:tcPr>
+          <w:p>
+            <w:pPr>
+              <w:jc w:val="center"/>
+              <w:rPr>
+                <w:rFonts w:ascii="Garamond" w:hAnsi="Garamond"/>
+                <w:sz w:val="24"/>
+                <w:szCs w:val="24"/>
+              </w:rPr>
+            </w:pPr>
+            <w:r>
+              <w:rPr>
+                <w:rFonts w:ascii="Garamond" w:hAnsi="Garamond"/>
+                <w:sz w:val="24"/>
+                <w:szCs w:val="24"/>
+              </w:rPr>
+              <w:t>52.09</w:t>
+            </w:r>
+          </w:p>
+        </w:tc>
+        <w:tc>
+          <w:tcPr>
+            <w:tcW w:w="1200" w:type="dxa"/>
+          </w:tcPr>
+          <w:p>
+            <w:pPr>
+              <w:jc w:val="center"/>
+              <w:rPr>
+                <w:rFonts w:ascii="Garamond" w:hAnsi="Garamond"/>
+                <w:sz w:val="24"/>
+                <w:szCs w:val="24"/>
+              </w:rPr>
+            </w:pPr>
+            <w:r>
+              <w:rPr>
+                <w:rFonts w:ascii="Garamond" w:hAnsi="Garamond"/>
+                <w:sz w:val="24"/>
+                <w:szCs w:val="24"/>
+              </w:rPr>
+              <w:t>35.99</w:t>
+            </w:r>
+          </w:p>
+        </w:tc>
+        <w:tc>
+          <w:tcPr>
+            <w:tcW w:w="1200" w:type="dxa"/>
+            <w:noWrap/>
+          </w:tcPr>
+          <w:p>
+            <w:pPr>
+              <w:jc w:val="center"/>
+              <w:rPr>
+                <w:rFonts w:ascii="Garamond" w:hAnsi="Garamond"/>
+                <w:sz w:val="24"/>
+                <w:szCs w:val="24"/>
+              </w:rPr>
+            </w:pPr>
+            <w:r>
+              <w:rPr>
+                <w:rFonts w:ascii="Garamond" w:hAnsi="Garamond"/>
+                <w:sz w:val="24"/>
+                <w:szCs w:val="24"/>
+              </w:rPr>
+              <w:t>90.38</w:t>
+            </w:r>
+          </w:p>
+        </w:tc>
+        <w:tc>
+          <w:tcPr>
+            <w:tcW w:w="1200" w:type="dxa"/>
+            <w:noWrap/>
+          </w:tcPr>
+          <w:p>
+            <w:pPr>
+              <w:jc w:val="center"/>
+              <w:rPr>
+                <w:rFonts w:ascii="Garamond" w:hAnsi="Garamond"/>
+                <w:sz w:val="24"/>
+                <w:szCs w:val="24"/>
+              </w:rPr>
+            </w:pPr>
+            <w:r>
+              <w:rPr>
+                <w:rFonts w:ascii="Garamond" w:hAnsi="Garamond"/>
+                <w:sz w:val="24"/>
+                <w:szCs w:val="24"/>
+              </w:rPr>
+              <w:t>41.71</w:t>
+            </w:r>
+          </w:p>
+        </w:tc>
+        <w:tc>
+          <w:tcPr>
+            <w:tcW w:w="960" w:type="dxa"/>
+          </w:tcPr>
+          <w:p>
+            <w:pPr>
+              <w:jc w:val="center"/>
+              <w:rPr>
+                <w:rFonts w:ascii="Garamond" w:hAnsi="Garamond"/>
+                <w:sz w:val="24"/>
+                <w:szCs w:val="24"/>
+              </w:rPr>
+            </w:pPr>
+            <w:r>
+              <w:rPr>
+                <w:rFonts w:ascii="Garamond" w:hAnsi="Garamond"/>
+                <w:sz w:val="24"/>
+                <w:szCs w:val="24"/>
+              </w:rPr>
+              <w:t>30.46</w:t>
+            </w:r>
+          </w:p>
+        </w:tc>
+        <w:tc>
+          <w:tcPr>
+            <w:tcW w:w="960" w:type="dxa"/>
+            <w:noWrap/>
+          </w:tcPr>
+          <w:p>
+            <w:pPr>
+              <w:jc w:val="center"/>
+              <w:rPr>
+                <w:rFonts w:ascii="Garamond" w:hAnsi="Garamond"/>
+                <w:sz w:val="24"/>
+                <w:szCs w:val="24"/>
+              </w:rPr>
+            </w:pPr>
+            <w:r>
+              <w:rPr>
+                <w:rFonts w:ascii="Garamond" w:hAnsi="Garamond"/>
+                <w:sz w:val="24"/>
+                <w:szCs w:val="24"/>
+              </w:rPr>
+              <w:t>67.42</w:t>
+            </w:r>
+          </w:p>
+        </w:tc>
+        <w:tc>
+          <w:tcPr>
+            <w:tcW w:w="960" w:type="dxa"/>
+          </w:tcPr>
+          <w:p>
+            <w:pPr>
+              <w:jc w:val="center"/>
+              <w:rPr>
+                <w:rFonts w:ascii="Garamond" w:hAnsi="Garamond"/>
+                <w:sz w:val="24"/>
+                <w:szCs w:val="24"/>
+              </w:rPr>
+            </w:pPr>
+          </w:p>
+        </w:tc>
+      </w:tr>
+      <w:tr>
+        <w:trPr>
+          <w:trHeight w:val="288"/>
+          <w:jc w:val="center"/>
+        </w:trPr>
+        <w:tc>
+          <w:tcPr>
+            <w:tcW w:w="1594" w:type="dxa"/>
+            <w:noWrap/>
           </w:tcPr>
           <w:p>
             <w:pPr>
@@ -6464,7 +6345,7 @@
                 <w:sz w:val="24"/>
                 <w:szCs w:val="24"/>
               </w:rPr>
-              <w:t>43.71</w:t>
+              <w:t>44.61</w:t>
             </w:r>
           </w:p>
         </w:tc>
@@ -6487,7 +6368,7 @@
                 <w:sz w:val="24"/>
                 <w:szCs w:val="24"/>
               </w:rPr>
-              <w:t>26.17</w:t>
+              <w:t>26.38</w:t>
             </w:r>
           </w:p>
         </w:tc>
@@ -6511,7 +6392,7 @@
                 <w:sz w:val="24"/>
                 <w:szCs w:val="24"/>
               </w:rPr>
-              <w:t>107.33</w:t>
+              <w:t>108.63</w:t>
             </w:r>
           </w:p>
         </w:tc>
@@ -6535,7 +6416,7 @@
                 <w:sz w:val="24"/>
                 <w:szCs w:val="24"/>
               </w:rPr>
-              <w:t>42.72</w:t>
+              <w:t>42.73</w:t>
             </w:r>
           </w:p>
         </w:tc>
@@ -6558,7 +6439,7 @@
                 <w:sz w:val="24"/>
                 <w:szCs w:val="24"/>
               </w:rPr>
-              <w:t>24.02</w:t>
+              <w:t>24.41</w:t>
             </w:r>
           </w:p>
         </w:tc>
@@ -6582,7 +6463,7 @@
                 <w:sz w:val="24"/>
                 <w:szCs w:val="24"/>
               </w:rPr>
-              <w:t>120.12</w:t>
+              <w:t>111.03</w:t>
             </w:r>
           </w:p>
         </w:tc>
@@ -6599,18 +6480,13 @@
                 <w:szCs w:val="24"/>
               </w:rPr>
             </w:pPr>
-            <w:r>
-              <w:rPr>
-                <w:rFonts w:ascii="Garamond" w:hAnsi="Garamond"/>
-                <w:sz w:val="24"/>
-                <w:szCs w:val="24"/>
-              </w:rPr>
-              <w:t>72</w:t>
-            </w:r>
           </w:p>
         </w:tc>
       </w:tr>
     </w:tbl>
+    <w:p/>
+    <w:p/>
+    <w:p/>
     <w:p/>
     <w:p/>
     <w:p>
@@ -6968,7 +6844,7 @@
                 <w:sz w:val="24"/>
                 <w:szCs w:val="24"/>
               </w:rPr>
-              <w:t>45.15</w:t>
+              <w:t>47.17</w:t>
             </w:r>
           </w:p>
         </w:tc>
@@ -6991,7 +6867,7 @@
                 <w:sz w:val="24"/>
                 <w:szCs w:val="24"/>
               </w:rPr>
-              <w:t>36.13</w:t>
+              <w:t>37.47</w:t>
             </w:r>
           </w:p>
         </w:tc>
@@ -7015,7 +6891,7 @@
                 <w:sz w:val="24"/>
                 <w:szCs w:val="24"/>
               </w:rPr>
-              <w:t>57.24</w:t>
+              <w:t>60.64</w:t>
             </w:r>
           </w:p>
         </w:tc>
@@ -7039,7 +6915,7 @@
                 <w:sz w:val="24"/>
                 <w:szCs w:val="24"/>
               </w:rPr>
-              <w:t>34.74</w:t>
+              <w:t>37.41</w:t>
             </w:r>
           </w:p>
         </w:tc>
@@ -7062,7 +6938,7 @@
                 <w:sz w:val="24"/>
                 <w:szCs w:val="24"/>
               </w:rPr>
-              <w:t>27.04</w:t>
+              <w:t>30.14</w:t>
             </w:r>
           </w:p>
         </w:tc>
@@ -7086,7 +6962,7 @@
                 <w:sz w:val="24"/>
                 <w:szCs w:val="24"/>
               </w:rPr>
-              <w:t>45.02</w:t>
+              <w:t>48.62</w:t>
             </w:r>
           </w:p>
         </w:tc>
@@ -7171,7 +7047,7 @@
                 <w:sz w:val="24"/>
                 <w:szCs w:val="24"/>
               </w:rPr>
-              <w:t>38.92</w:t>
+              <w:t>37.86</w:t>
             </w:r>
           </w:p>
         </w:tc>
@@ -7194,7 +7070,7 @@
                 <w:sz w:val="24"/>
                 <w:szCs w:val="24"/>
               </w:rPr>
-              <w:t>30.11</w:t>
+              <w:t>28.29</w:t>
             </w:r>
           </w:p>
         </w:tc>
@@ -7218,7 +7094,7 @@
                 <w:sz w:val="24"/>
                 <w:szCs w:val="24"/>
               </w:rPr>
-              <w:t>52.67</w:t>
+              <w:t>51.91</w:t>
             </w:r>
           </w:p>
         </w:tc>
@@ -7242,7 +7118,7 @@
                 <w:sz w:val="24"/>
                 <w:szCs w:val="24"/>
               </w:rPr>
-              <w:t>36.02</w:t>
+              <w:t>35.67</w:t>
             </w:r>
           </w:p>
         </w:tc>
@@ -7265,7 +7141,7 @@
                 <w:sz w:val="24"/>
                 <w:szCs w:val="24"/>
               </w:rPr>
-              <w:t>26.63</w:t>
+              <w:t>27.15</w:t>
             </w:r>
           </w:p>
         </w:tc>
@@ -7289,7 +7165,7 @@
                 <w:sz w:val="24"/>
                 <w:szCs w:val="24"/>
               </w:rPr>
-              <w:t>51.36</w:t>
+              <w:t>51.70</w:t>
             </w:r>
           </w:p>
         </w:tc>
@@ -7313,316 +7189,6 @@
                 <w:szCs w:val="24"/>
               </w:rPr>
               <w:t>101</w:t>
-            </w:r>
-          </w:p>
-        </w:tc>
-      </w:tr>
-    </w:tbl>
-    <w:p/>
-    <w:p/>
-    <w:p/>
-    <w:p>
-      <w:pPr>
-        <w:rPr>
-          <w:rFonts w:ascii="Garamond" w:hAnsi="Garamond"/>
-          <w:sz w:val="24"/>
-          <w:szCs w:val="24"/>
-        </w:rPr>
-      </w:pPr>
-      <w:r>
-        <w:rPr>
-          <w:rFonts w:ascii="Garamond" w:hAnsi="Garamond"/>
-          <w:sz w:val="24"/>
-          <w:szCs w:val="24"/>
-        </w:rPr>
-        <w:t xml:space="preserve">Table </w:t>
-      </w:r>
-      <w:r>
-        <w:rPr>
-          <w:rFonts w:ascii="Garamond" w:hAnsi="Garamond"/>
-          <w:sz w:val="24"/>
-          <w:szCs w:val="24"/>
-        </w:rPr>
-        <w:t>8</w:t>
-      </w:r>
-      <w:r>
-        <w:rPr>
-          <w:rFonts w:ascii="Garamond" w:hAnsi="Garamond"/>
-          <w:sz w:val="24"/>
-          <w:szCs w:val="24"/>
-        </w:rPr>
-        <w:t>. Table of bootstrapped densities with lower and upper confidence intervals and the number of binned data samples</w:t>
-      </w:r>
-      <w:r>
-        <w:rPr>
-          <w:rFonts w:ascii="Garamond" w:hAnsi="Garamond"/>
-          <w:sz w:val="24"/>
-          <w:szCs w:val="24"/>
-        </w:rPr>
-        <w:t xml:space="preserve"> for the schools for the entire area</w:t>
-      </w:r>
-      <w:r>
-        <w:rPr>
-          <w:rFonts w:ascii="Garamond" w:hAnsi="Garamond"/>
-          <w:sz w:val="24"/>
-          <w:szCs w:val="24"/>
-        </w:rPr>
-        <w:t>.</w:t>
-      </w:r>
-      <w:r>
-        <w:rPr>
-          <w:rFonts w:ascii="Garamond" w:hAnsi="Garamond"/>
-          <w:sz w:val="24"/>
-          <w:szCs w:val="24"/>
-        </w:rPr>
-        <w:t xml:space="preserve">  </w:t>
-      </w:r>
-      <w:r>
-        <w:rPr>
-          <w:rFonts w:ascii="Garamond" w:hAnsi="Garamond"/>
-          <w:sz w:val="24"/>
-          <w:szCs w:val="24"/>
-        </w:rPr>
-        <w:t>grid_ll.</w:t>
-      </w:r>
-      <w:r>
-        <w:rPr>
-          <w:rFonts w:ascii="Garamond" w:hAnsi="Garamond"/>
-          <w:sz w:val="24"/>
-          <w:szCs w:val="24"/>
-        </w:rPr>
-        <w:t>2</w:t>
-      </w:r>
-      <w:r>
-        <w:rPr>
-          <w:rFonts w:ascii="Garamond" w:hAnsi="Garamond"/>
-          <w:sz w:val="24"/>
-          <w:szCs w:val="24"/>
-        </w:rPr>
-        <w:t>_lt_.1</w:t>
-      </w:r>
-    </w:p>
-    <w:p>
-      <w:pPr>
-        <w:rPr>
-          <w:rFonts w:ascii="Garamond" w:hAnsi="Garamond"/>
-          <w:sz w:val="24"/>
-          <w:szCs w:val="24"/>
-        </w:rPr>
-      </w:pPr>
-    </w:p>
-    <w:tbl>
-      <w:tblPr>
-        <w:tblStyle w:val="TableGrid"/>
-        <w:tblW w:w="0" w:type="auto"/>
-        <w:jc w:val="center"/>
-        <w:tblLook w:val="04A0" w:firstRow="1" w:lastRow="0" w:firstColumn="1" w:lastColumn="0" w:noHBand="0" w:noVBand="1"/>
-      </w:tblPr>
-      <w:tblGrid>
-        <w:gridCol w:w="1594"/>
-        <w:gridCol w:w="1200"/>
-        <w:gridCol w:w="1200"/>
-        <w:gridCol w:w="1200"/>
-        <w:gridCol w:w="1200"/>
-        <w:gridCol w:w="960"/>
-        <w:gridCol w:w="960"/>
-        <w:gridCol w:w="1007"/>
-      </w:tblGrid>
-      <w:tr>
-        <w:trPr>
-          <w:trHeight w:val="288"/>
-          <w:jc w:val="center"/>
-        </w:trPr>
-        <w:tc>
-          <w:tcPr>
-            <w:tcW w:w="1594" w:type="dxa"/>
-            <w:noWrap/>
-            <w:hideMark/>
-          </w:tcPr>
-          <w:p>
-            <w:pPr>
-              <w:rPr>
-                <w:rFonts w:ascii="Garamond" w:hAnsi="Garamond"/>
-                <w:sz w:val="24"/>
-                <w:szCs w:val="24"/>
-              </w:rPr>
-            </w:pPr>
-            <w:r>
-              <w:rPr>
-                <w:rFonts w:ascii="Garamond" w:hAnsi="Garamond"/>
-                <w:sz w:val="24"/>
-                <w:szCs w:val="24"/>
-              </w:rPr>
-              <w:t>Glider</w:t>
-            </w:r>
-          </w:p>
-        </w:tc>
-        <w:tc>
-          <w:tcPr>
-            <w:tcW w:w="1200" w:type="dxa"/>
-            <w:noWrap/>
-            <w:hideMark/>
-          </w:tcPr>
-          <w:p>
-            <w:pPr>
-              <w:jc w:val="center"/>
-              <w:rPr>
-                <w:rFonts w:ascii="Garamond" w:hAnsi="Garamond"/>
-                <w:sz w:val="24"/>
-                <w:szCs w:val="24"/>
-              </w:rPr>
-            </w:pPr>
-            <w:r>
-              <w:rPr>
-                <w:rFonts w:ascii="Garamond" w:hAnsi="Garamond"/>
-                <w:sz w:val="24"/>
-                <w:szCs w:val="24"/>
-              </w:rPr>
-              <w:t>70 kHz density</w:t>
-            </w:r>
-          </w:p>
-        </w:tc>
-        <w:tc>
-          <w:tcPr>
-            <w:tcW w:w="1200" w:type="dxa"/>
-          </w:tcPr>
-          <w:p>
-            <w:pPr>
-              <w:jc w:val="center"/>
-              <w:rPr>
-                <w:rFonts w:ascii="Garamond" w:hAnsi="Garamond"/>
-                <w:sz w:val="24"/>
-                <w:szCs w:val="24"/>
-              </w:rPr>
-            </w:pPr>
-            <w:r>
-              <w:rPr>
-                <w:rFonts w:ascii="Garamond" w:hAnsi="Garamond"/>
-                <w:sz w:val="24"/>
-                <w:szCs w:val="24"/>
-              </w:rPr>
-              <w:t>Lower CI</w:t>
-            </w:r>
-          </w:p>
-        </w:tc>
-        <w:tc>
-          <w:tcPr>
-            <w:tcW w:w="1200" w:type="dxa"/>
-            <w:noWrap/>
-            <w:hideMark/>
-          </w:tcPr>
-          <w:p>
-            <w:pPr>
-              <w:jc w:val="center"/>
-              <w:rPr>
-                <w:rFonts w:ascii="Garamond" w:hAnsi="Garamond"/>
-                <w:sz w:val="24"/>
-                <w:szCs w:val="24"/>
-              </w:rPr>
-            </w:pPr>
-            <w:r>
-              <w:rPr>
-                <w:rFonts w:ascii="Garamond" w:hAnsi="Garamond"/>
-                <w:sz w:val="24"/>
-                <w:szCs w:val="24"/>
-              </w:rPr>
-              <w:t>Upper CI</w:t>
-            </w:r>
-          </w:p>
-        </w:tc>
-        <w:tc>
-          <w:tcPr>
-            <w:tcW w:w="1200" w:type="dxa"/>
-            <w:noWrap/>
-            <w:hideMark/>
-          </w:tcPr>
-          <w:p>
-            <w:pPr>
-              <w:jc w:val="center"/>
-              <w:rPr>
-                <w:rFonts w:ascii="Garamond" w:hAnsi="Garamond"/>
-                <w:sz w:val="24"/>
-                <w:szCs w:val="24"/>
-              </w:rPr>
-            </w:pPr>
-            <w:r>
-              <w:rPr>
-                <w:rFonts w:ascii="Garamond" w:hAnsi="Garamond"/>
-                <w:sz w:val="24"/>
-                <w:szCs w:val="24"/>
-              </w:rPr>
-              <w:t>120 kHz density</w:t>
-            </w:r>
-          </w:p>
-        </w:tc>
-        <w:tc>
-          <w:tcPr>
-            <w:tcW w:w="960" w:type="dxa"/>
-          </w:tcPr>
-          <w:p>
-            <w:pPr>
-              <w:jc w:val="center"/>
-              <w:rPr>
-                <w:rFonts w:ascii="Garamond" w:hAnsi="Garamond"/>
-                <w:sz w:val="24"/>
-                <w:szCs w:val="24"/>
-              </w:rPr>
-            </w:pPr>
-            <w:r>
-              <w:rPr>
-                <w:rFonts w:ascii="Garamond" w:hAnsi="Garamond"/>
-                <w:sz w:val="24"/>
-                <w:szCs w:val="24"/>
-              </w:rPr>
-              <w:t>Lower CI</w:t>
-            </w:r>
-          </w:p>
-        </w:tc>
-        <w:tc>
-          <w:tcPr>
-            <w:tcW w:w="960" w:type="dxa"/>
-            <w:noWrap/>
-            <w:hideMark/>
-          </w:tcPr>
-          <w:p>
-            <w:pPr>
-              <w:jc w:val="center"/>
-              <w:rPr>
-                <w:rFonts w:ascii="Garamond" w:hAnsi="Garamond"/>
-                <w:sz w:val="24"/>
-                <w:szCs w:val="24"/>
-              </w:rPr>
-            </w:pPr>
-            <w:r>
-              <w:rPr>
-                <w:rFonts w:ascii="Garamond" w:hAnsi="Garamond"/>
-                <w:sz w:val="24"/>
-                <w:szCs w:val="24"/>
-              </w:rPr>
-              <w:t>Upper CI</w:t>
-            </w:r>
-          </w:p>
-        </w:tc>
-        <w:tc>
-          <w:tcPr>
-            <w:tcW w:w="960" w:type="dxa"/>
-          </w:tcPr>
-          <w:p>
-            <w:pPr>
-              <w:jc w:val="center"/>
-              <w:rPr>
-                <w:rFonts w:ascii="Garamond" w:hAnsi="Garamond"/>
-                <w:sz w:val="24"/>
-                <w:szCs w:val="24"/>
-              </w:rPr>
-            </w:pPr>
-            <w:r>
-              <w:rPr>
-                <w:rFonts w:ascii="Garamond" w:hAnsi="Garamond"/>
-                <w:sz w:val="24"/>
-                <w:szCs w:val="24"/>
-              </w:rPr>
-              <w:t>Number of samples</w:t>
             </w:r>
           </w:p>
         </w:tc>
@@ -7636,23 +7202,22 @@
           <w:tcPr>
             <w:tcW w:w="1594" w:type="dxa"/>
             <w:noWrap/>
-            <w:hideMark/>
-          </w:tcPr>
-          <w:p>
-            <w:pPr>
-              <w:rPr>
-                <w:rFonts w:ascii="Garamond" w:hAnsi="Garamond"/>
-                <w:sz w:val="24"/>
-                <w:szCs w:val="24"/>
-              </w:rPr>
-            </w:pPr>
-            <w:r>
-              <w:rPr>
-                <w:rFonts w:ascii="Garamond" w:hAnsi="Garamond"/>
-                <w:sz w:val="24"/>
-                <w:szCs w:val="24"/>
-              </w:rPr>
-              <w:t>AMLR03</w:t>
+          </w:tcPr>
+          <w:p>
+            <w:pPr>
+              <w:rPr>
+                <w:rFonts w:ascii="Garamond" w:hAnsi="Garamond"/>
+                <w:sz w:val="24"/>
+                <w:szCs w:val="24"/>
+              </w:rPr>
+            </w:pPr>
+            <w:r>
+              <w:rPr>
+                <w:rFonts w:ascii="Garamond" w:hAnsi="Garamond"/>
+                <w:sz w:val="24"/>
+                <w:szCs w:val="24"/>
+              </w:rPr>
+              <w:t>Schools</w:t>
             </w:r>
           </w:p>
         </w:tc>
@@ -7670,14 +7235,6 @@
                 <w:szCs w:val="24"/>
               </w:rPr>
             </w:pPr>
-            <w:r>
-              <w:rPr>
-                <w:rFonts w:ascii="Garamond" w:hAnsi="Garamond"/>
-                <w:sz w:val="24"/>
-                <w:szCs w:val="24"/>
-              </w:rPr>
-              <w:t>38.70</w:t>
-            </w:r>
           </w:p>
         </w:tc>
         <w:tc>
@@ -7693,14 +7250,6 @@
                 <w:szCs w:val="24"/>
               </w:rPr>
             </w:pPr>
-            <w:r>
-              <w:rPr>
-                <w:rFonts w:ascii="Garamond" w:hAnsi="Garamond"/>
-                <w:sz w:val="24"/>
-                <w:szCs w:val="24"/>
-              </w:rPr>
-              <w:t>30.23</w:t>
-            </w:r>
           </w:p>
         </w:tc>
         <w:tc>
@@ -7717,14 +7266,6 @@
                 <w:szCs w:val="24"/>
               </w:rPr>
             </w:pPr>
-            <w:r>
-              <w:rPr>
-                <w:rFonts w:ascii="Garamond" w:hAnsi="Garamond"/>
-                <w:sz w:val="24"/>
-                <w:szCs w:val="24"/>
-              </w:rPr>
-              <w:t>50.21</w:t>
-            </w:r>
           </w:p>
         </w:tc>
         <w:tc>
@@ -7741,14 +7282,6 @@
                 <w:szCs w:val="24"/>
               </w:rPr>
             </w:pPr>
-            <w:r>
-              <w:rPr>
-                <w:rFonts w:ascii="Garamond" w:hAnsi="Garamond"/>
-                <w:sz w:val="24"/>
-                <w:szCs w:val="24"/>
-              </w:rPr>
-              <w:t>31.33</w:t>
-            </w:r>
           </w:p>
         </w:tc>
         <w:tc>
@@ -7764,14 +7297,6 @@
                 <w:szCs w:val="24"/>
               </w:rPr>
             </w:pPr>
-            <w:r>
-              <w:rPr>
-                <w:rFonts w:ascii="Garamond" w:hAnsi="Garamond"/>
-                <w:sz w:val="24"/>
-                <w:szCs w:val="24"/>
-              </w:rPr>
-              <w:t>24.01</w:t>
-            </w:r>
           </w:p>
         </w:tc>
         <w:tc>
@@ -7788,14 +7313,6 @@
                 <w:szCs w:val="24"/>
               </w:rPr>
             </w:pPr>
-            <w:r>
-              <w:rPr>
-                <w:rFonts w:ascii="Garamond" w:hAnsi="Garamond"/>
-                <w:sz w:val="24"/>
-                <w:szCs w:val="24"/>
-              </w:rPr>
-              <w:t>40.87</w:t>
-            </w:r>
           </w:p>
         </w:tc>
         <w:tc>
@@ -7811,14 +7328,6 @@
                 <w:szCs w:val="24"/>
               </w:rPr>
             </w:pPr>
-            <w:r>
-              <w:rPr>
-                <w:rFonts w:ascii="Garamond" w:hAnsi="Garamond"/>
-                <w:sz w:val="24"/>
-                <w:szCs w:val="24"/>
-              </w:rPr>
-              <w:t>106</w:t>
-            </w:r>
           </w:p>
         </w:tc>
       </w:tr>
@@ -7831,7 +7340,192 @@
           <w:tcPr>
             <w:tcW w:w="1594" w:type="dxa"/>
             <w:noWrap/>
-            <w:hideMark/>
+          </w:tcPr>
+          <w:p>
+            <w:pPr>
+              <w:rPr>
+                <w:rFonts w:ascii="Garamond" w:hAnsi="Garamond"/>
+                <w:sz w:val="24"/>
+                <w:szCs w:val="24"/>
+              </w:rPr>
+            </w:pPr>
+            <w:r>
+              <w:rPr>
+                <w:rFonts w:ascii="Garamond" w:hAnsi="Garamond"/>
+                <w:sz w:val="24"/>
+                <w:szCs w:val="24"/>
+              </w:rPr>
+              <w:t>AMLR03</w:t>
+            </w:r>
+          </w:p>
+        </w:tc>
+        <w:tc>
+          <w:tcPr>
+            <w:tcW w:w="1200" w:type="dxa"/>
+            <w:noWrap/>
+          </w:tcPr>
+          <w:p>
+            <w:pPr>
+              <w:jc w:val="center"/>
+              <w:rPr>
+                <w:rFonts w:ascii="Garamond" w:hAnsi="Garamond"/>
+                <w:sz w:val="24"/>
+                <w:szCs w:val="24"/>
+              </w:rPr>
+            </w:pPr>
+            <w:r>
+              <w:rPr>
+                <w:rFonts w:ascii="Garamond" w:hAnsi="Garamond"/>
+                <w:sz w:val="24"/>
+                <w:szCs w:val="24"/>
+              </w:rPr>
+              <w:t>41.28</w:t>
+            </w:r>
+          </w:p>
+        </w:tc>
+        <w:tc>
+          <w:tcPr>
+            <w:tcW w:w="1200" w:type="dxa"/>
+          </w:tcPr>
+          <w:p>
+            <w:pPr>
+              <w:jc w:val="center"/>
+              <w:rPr>
+                <w:rFonts w:ascii="Garamond" w:hAnsi="Garamond"/>
+                <w:sz w:val="24"/>
+                <w:szCs w:val="24"/>
+              </w:rPr>
+            </w:pPr>
+            <w:r>
+              <w:rPr>
+                <w:rFonts w:ascii="Garamond" w:hAnsi="Garamond"/>
+                <w:sz w:val="24"/>
+                <w:szCs w:val="24"/>
+              </w:rPr>
+              <w:t>31.91</w:t>
+            </w:r>
+          </w:p>
+        </w:tc>
+        <w:tc>
+          <w:tcPr>
+            <w:tcW w:w="1200" w:type="dxa"/>
+            <w:noWrap/>
+          </w:tcPr>
+          <w:p>
+            <w:pPr>
+              <w:jc w:val="center"/>
+              <w:rPr>
+                <w:rFonts w:ascii="Garamond" w:hAnsi="Garamond"/>
+                <w:sz w:val="24"/>
+                <w:szCs w:val="24"/>
+              </w:rPr>
+            </w:pPr>
+            <w:r>
+              <w:rPr>
+                <w:rFonts w:ascii="Garamond" w:hAnsi="Garamond"/>
+                <w:sz w:val="24"/>
+                <w:szCs w:val="24"/>
+              </w:rPr>
+              <w:t>55.75</w:t>
+            </w:r>
+          </w:p>
+        </w:tc>
+        <w:tc>
+          <w:tcPr>
+            <w:tcW w:w="1200" w:type="dxa"/>
+            <w:noWrap/>
+          </w:tcPr>
+          <w:p>
+            <w:pPr>
+              <w:jc w:val="center"/>
+              <w:rPr>
+                <w:rFonts w:ascii="Garamond" w:hAnsi="Garamond"/>
+                <w:sz w:val="24"/>
+                <w:szCs w:val="24"/>
+              </w:rPr>
+            </w:pPr>
+            <w:r>
+              <w:rPr>
+                <w:rFonts w:ascii="Garamond" w:hAnsi="Garamond"/>
+                <w:sz w:val="24"/>
+                <w:szCs w:val="24"/>
+              </w:rPr>
+              <w:t>33.82</w:t>
+            </w:r>
+          </w:p>
+        </w:tc>
+        <w:tc>
+          <w:tcPr>
+            <w:tcW w:w="960" w:type="dxa"/>
+          </w:tcPr>
+          <w:p>
+            <w:pPr>
+              <w:jc w:val="center"/>
+              <w:rPr>
+                <w:rFonts w:ascii="Garamond" w:hAnsi="Garamond"/>
+                <w:sz w:val="24"/>
+                <w:szCs w:val="24"/>
+              </w:rPr>
+            </w:pPr>
+            <w:r>
+              <w:rPr>
+                <w:rFonts w:ascii="Garamond" w:hAnsi="Garamond"/>
+                <w:sz w:val="24"/>
+                <w:szCs w:val="24"/>
+              </w:rPr>
+              <w:t>26.09</w:t>
+            </w:r>
+          </w:p>
+        </w:tc>
+        <w:tc>
+          <w:tcPr>
+            <w:tcW w:w="960" w:type="dxa"/>
+            <w:noWrap/>
+          </w:tcPr>
+          <w:p>
+            <w:pPr>
+              <w:jc w:val="center"/>
+              <w:rPr>
+                <w:rFonts w:ascii="Garamond" w:hAnsi="Garamond"/>
+                <w:sz w:val="24"/>
+                <w:szCs w:val="24"/>
+              </w:rPr>
+            </w:pPr>
+            <w:r>
+              <w:rPr>
+                <w:rFonts w:ascii="Garamond" w:hAnsi="Garamond"/>
+                <w:sz w:val="24"/>
+                <w:szCs w:val="24"/>
+              </w:rPr>
+              <w:t>44.41</w:t>
+            </w:r>
+          </w:p>
+        </w:tc>
+        <w:tc>
+          <w:tcPr>
+            <w:tcW w:w="960" w:type="dxa"/>
+          </w:tcPr>
+          <w:p>
+            <w:pPr>
+              <w:jc w:val="center"/>
+              <w:rPr>
+                <w:rFonts w:ascii="Garamond" w:hAnsi="Garamond"/>
+                <w:sz w:val="24"/>
+                <w:szCs w:val="24"/>
+              </w:rPr>
+            </w:pPr>
+          </w:p>
+        </w:tc>
+      </w:tr>
+      <w:tr>
+        <w:trPr>
+          <w:trHeight w:val="288"/>
+          <w:jc w:val="center"/>
+        </w:trPr>
+        <w:tc>
+          <w:tcPr>
+            <w:tcW w:w="1594" w:type="dxa"/>
+            <w:noWrap/>
           </w:tcPr>
           <w:p>
             <w:pPr>
@@ -7871,7 +7565,7 @@
                 <w:sz w:val="24"/>
                 <w:szCs w:val="24"/>
               </w:rPr>
-              <w:t>34.37</w:t>
+              <w:t>34.13</w:t>
             </w:r>
           </w:p>
         </w:tc>
@@ -7894,7 +7588,7 @@
                 <w:sz w:val="24"/>
                 <w:szCs w:val="24"/>
               </w:rPr>
-              <w:t>25.00</w:t>
+              <w:t>25.05</w:t>
             </w:r>
           </w:p>
         </w:tc>
@@ -7918,7 +7612,7 @@
                 <w:sz w:val="24"/>
                 <w:szCs w:val="24"/>
               </w:rPr>
-              <w:t>48.13</w:t>
+              <w:t>49.10</w:t>
             </w:r>
           </w:p>
         </w:tc>
@@ -7942,7 +7636,7 @@
                 <w:sz w:val="24"/>
                 <w:szCs w:val="24"/>
               </w:rPr>
-              <w:t>32.75</w:t>
+              <w:t>32.81</w:t>
             </w:r>
           </w:p>
         </w:tc>
@@ -7965,7 +7659,7 @@
                 <w:sz w:val="24"/>
                 <w:szCs w:val="24"/>
               </w:rPr>
-              <w:t>23.98</w:t>
+              <w:t>23.94</w:t>
             </w:r>
           </w:p>
         </w:tc>
@@ -7989,7 +7683,7 @@
                 <w:sz w:val="24"/>
                 <w:szCs w:val="24"/>
               </w:rPr>
-              <w:t>47.14</w:t>
+              <w:t>46.00</w:t>
             </w:r>
           </w:p>
         </w:tc>
@@ -8006,84 +7700,32 @@
                 <w:szCs w:val="24"/>
               </w:rPr>
             </w:pPr>
-            <w:r>
-              <w:rPr>
-                <w:rFonts w:ascii="Garamond" w:hAnsi="Garamond"/>
-                <w:sz w:val="24"/>
-                <w:szCs w:val="24"/>
-              </w:rPr>
-              <w:t>101</w:t>
-            </w:r>
           </w:p>
         </w:tc>
       </w:tr>
     </w:tbl>
     <w:p/>
+    <w:p/>
+    <w:p/>
+    <w:p/>
     <w:p>
-      <w:pPr>
-        <w:rPr>
-          <w:rFonts w:ascii="Garamond" w:hAnsi="Garamond"/>
-          <w:sz w:val="24"/>
-          <w:szCs w:val="24"/>
-        </w:rPr>
-      </w:pPr>
       <w:r>
-        <w:rPr>
-          <w:rFonts w:ascii="Garamond" w:hAnsi="Garamond"/>
-          <w:sz w:val="24"/>
-          <w:szCs w:val="24"/>
-        </w:rPr>
-        <w:t xml:space="preserve">Table </w:t>
+        <w:t xml:space="preserve">Table. All glider profiles </w:t>
       </w:r>
       <w:r>
-        <w:rPr>
-          <w:rFonts w:ascii="Garamond" w:hAnsi="Garamond"/>
-          <w:sz w:val="24"/>
-          <w:szCs w:val="24"/>
-        </w:rPr>
-        <w:t>9</w:t>
+        <w:t xml:space="preserve">(the entire area) </w:t>
       </w:r>
       <w:r>
-        <w:rPr>
-          <w:rFonts w:ascii="Garamond" w:hAnsi="Garamond"/>
-          <w:sz w:val="24"/>
-          <w:szCs w:val="24"/>
-        </w:rPr>
-        <w:t xml:space="preserve">. Antarctic krill density and biomass estimates, standard deviations and the number of profiles in the </w:t>
+        <w:t xml:space="preserve">for both all data and </w:t>
       </w:r>
+      <w:proofErr w:type="gramStart"/>
       <w:r>
-        <w:rPr>
-          <w:rFonts w:ascii="Garamond" w:hAnsi="Garamond"/>
-          <w:sz w:val="24"/>
-          <w:szCs w:val="24"/>
-        </w:rPr>
-        <w:t>entire area</w:t>
+        <w:t>schools</w:t>
       </w:r>
+      <w:proofErr w:type="gramEnd"/>
       <w:r>
-        <w:rPr>
-          <w:rFonts w:ascii="Garamond" w:hAnsi="Garamond"/>
-          <w:sz w:val="24"/>
-          <w:szCs w:val="24"/>
-        </w:rPr>
-        <w:t>.</w:t>
+        <w:t xml:space="preserve"> data</w:t>
       </w:r>
-      <w:r>
-        <w:rPr>
-          <w:rFonts w:ascii="Garamond" w:hAnsi="Garamond"/>
-          <w:sz w:val="24"/>
-          <w:szCs w:val="24"/>
-        </w:rPr>
-        <w:t xml:space="preserve"> May need to check the area is correct for this and the bootstrapped.</w:t>
-      </w:r>
-    </w:p>
-    <w:p>
-      <w:pPr>
-        <w:rPr>
-          <w:rFonts w:ascii="Garamond" w:hAnsi="Garamond" w:cstheme="minorHAnsi"/>
-          <w:sz w:val="24"/>
-          <w:szCs w:val="24"/>
-        </w:rPr>
-      </w:pPr>
     </w:p>
     <w:tbl>
       <w:tblPr>
@@ -8124,7 +7766,6 @@
                 <w:sz w:val="24"/>
                 <w:szCs w:val="24"/>
               </w:rPr>
-              <w:lastRenderedPageBreak/>
               <w:t>Glider</w:t>
             </w:r>
           </w:p>
@@ -8358,7 +7999,7 @@
                 <w:sz w:val="24"/>
                 <w:szCs w:val="24"/>
               </w:rPr>
-              <w:t>Survey profiles</w:t>
+              <w:t>profiles</w:t>
             </w:r>
           </w:p>
           <w:p>
@@ -8426,7 +8067,7 @@
                 <w:sz w:val="24"/>
                 <w:szCs w:val="24"/>
               </w:rPr>
-              <w:t>45.32</w:t>
+              <w:t>47.86</w:t>
             </w:r>
           </w:p>
         </w:tc>
@@ -8449,7 +8090,7 @@
                 <w:sz w:val="24"/>
                 <w:szCs w:val="24"/>
               </w:rPr>
-              <w:t>137.46</w:t>
+              <w:t>144.98</w:t>
             </w:r>
           </w:p>
         </w:tc>
@@ -8472,7 +8113,7 @@
                 <w:sz w:val="24"/>
                 <w:szCs w:val="24"/>
               </w:rPr>
-              <w:t>4.0791e+05</w:t>
+              <w:t>4.3075e+05</w:t>
             </w:r>
           </w:p>
         </w:tc>
@@ -8495,7 +8136,7 @@
                 <w:sz w:val="24"/>
                 <w:szCs w:val="24"/>
               </w:rPr>
-              <w:t>34.08</w:t>
+              <w:t>36.80</w:t>
             </w:r>
           </w:p>
         </w:tc>
@@ -8518,7 +8159,7 @@
                 <w:sz w:val="24"/>
                 <w:szCs w:val="24"/>
               </w:rPr>
-              <w:t>100.18</w:t>
+              <w:t>106.29</w:t>
             </w:r>
           </w:p>
         </w:tc>
@@ -8541,7 +8182,7 @@
                 <w:sz w:val="24"/>
                 <w:szCs w:val="24"/>
               </w:rPr>
-              <w:t>3.0670e+05</w:t>
+              <w:t>3.3120e+05</w:t>
             </w:r>
           </w:p>
         </w:tc>
@@ -8558,14 +8199,6 @@
                 <w:szCs w:val="24"/>
               </w:rPr>
             </w:pPr>
-            <w:r>
-              <w:rPr>
-                <w:rFonts w:ascii="Garamond" w:hAnsi="Garamond"/>
-                <w:sz w:val="24"/>
-                <w:szCs w:val="24"/>
-              </w:rPr>
-              <w:t>561</w:t>
-            </w:r>
           </w:p>
         </w:tc>
       </w:tr>
@@ -8614,7 +8247,7 @@
                 <w:sz w:val="24"/>
                 <w:szCs w:val="24"/>
               </w:rPr>
-              <w:t>39.33</w:t>
+              <w:t>38.19</w:t>
             </w:r>
           </w:p>
         </w:tc>
@@ -8637,7 +8270,7 @@
                 <w:sz w:val="24"/>
                 <w:szCs w:val="24"/>
               </w:rPr>
-              <w:t>103.47</w:t>
+              <w:t>103.48</w:t>
             </w:r>
           </w:p>
         </w:tc>
@@ -8660,7 +8293,7 @@
                 <w:sz w:val="24"/>
                 <w:szCs w:val="24"/>
               </w:rPr>
-              <w:t>3.5397e+05</w:t>
+              <w:t>3.4367e+05</w:t>
             </w:r>
           </w:p>
         </w:tc>
@@ -8683,7 +8316,7 @@
                 <w:sz w:val="24"/>
                 <w:szCs w:val="24"/>
               </w:rPr>
-              <w:t>36.86</w:t>
+              <w:t>36.63</w:t>
             </w:r>
           </w:p>
         </w:tc>
@@ -8706,7 +8339,7 @@
                 <w:sz w:val="24"/>
                 <w:szCs w:val="24"/>
               </w:rPr>
-              <w:t>112.09</w:t>
+              <w:t>112.11</w:t>
             </w:r>
           </w:p>
         </w:tc>
@@ -8729,7 +8362,7 @@
                 <w:sz w:val="24"/>
                 <w:szCs w:val="24"/>
               </w:rPr>
-              <w:t>3.3173e+05</w:t>
+              <w:t>3.2969e+05</w:t>
             </w:r>
           </w:p>
         </w:tc>
@@ -8739,21 +8372,501 @@
           </w:tcPr>
           <w:p>
             <w:pPr>
-              <w:jc w:val="center"/>
-              <w:rPr>
-                <w:rFonts w:ascii="Garamond" w:hAnsi="Garamond"/>
-                <w:sz w:val="24"/>
-                <w:szCs w:val="24"/>
-              </w:rPr>
-            </w:pPr>
-            <w:r>
-              <w:rPr>
-                <w:rFonts w:ascii="Garamond" w:hAnsi="Garamond"/>
-                <w:sz w:val="24"/>
-                <w:szCs w:val="24"/>
-              </w:rPr>
-              <w:t>563</w:t>
-            </w:r>
+              <w:rPr>
+                <w:rFonts w:ascii="Garamond" w:hAnsi="Garamond"/>
+                <w:sz w:val="24"/>
+                <w:szCs w:val="24"/>
+              </w:rPr>
+            </w:pPr>
+          </w:p>
+        </w:tc>
+      </w:tr>
+      <w:tr>
+        <w:trPr>
+          <w:jc w:val="center"/>
+        </w:trPr>
+        <w:tc>
+          <w:tcPr>
+            <w:tcW w:w="1169" w:type="dxa"/>
+          </w:tcPr>
+          <w:p>
+            <w:pPr>
+              <w:rPr>
+                <w:rFonts w:ascii="Garamond" w:hAnsi="Garamond"/>
+                <w:sz w:val="24"/>
+                <w:szCs w:val="24"/>
+              </w:rPr>
+            </w:pPr>
+            <w:r>
+              <w:rPr>
+                <w:rFonts w:ascii="Garamond" w:hAnsi="Garamond"/>
+                <w:sz w:val="24"/>
+                <w:szCs w:val="24"/>
+              </w:rPr>
+              <w:t>Schools</w:t>
+            </w:r>
+          </w:p>
+        </w:tc>
+        <w:tc>
+          <w:tcPr>
+            <w:tcW w:w="867" w:type="dxa"/>
+          </w:tcPr>
+          <w:p>
+            <w:pPr>
+              <w:jc w:val="center"/>
+              <w:rPr>
+                <w:rFonts w:ascii="Garamond" w:hAnsi="Garamond"/>
+                <w:sz w:val="24"/>
+                <w:szCs w:val="24"/>
+              </w:rPr>
+            </w:pPr>
+          </w:p>
+        </w:tc>
+        <w:tc>
+          <w:tcPr>
+            <w:tcW w:w="1051" w:type="dxa"/>
+          </w:tcPr>
+          <w:p>
+            <w:pPr>
+              <w:jc w:val="center"/>
+              <w:rPr>
+                <w:rFonts w:ascii="Garamond" w:hAnsi="Garamond"/>
+                <w:sz w:val="24"/>
+                <w:szCs w:val="24"/>
+              </w:rPr>
+            </w:pPr>
+          </w:p>
+        </w:tc>
+        <w:tc>
+          <w:tcPr>
+            <w:tcW w:w="1051" w:type="dxa"/>
+          </w:tcPr>
+          <w:p>
+            <w:pPr>
+              <w:jc w:val="center"/>
+              <w:rPr>
+                <w:rFonts w:ascii="Garamond" w:hAnsi="Garamond"/>
+                <w:sz w:val="24"/>
+                <w:szCs w:val="24"/>
+              </w:rPr>
+            </w:pPr>
+          </w:p>
+        </w:tc>
+        <w:tc>
+          <w:tcPr>
+            <w:tcW w:w="867" w:type="dxa"/>
+          </w:tcPr>
+          <w:p>
+            <w:pPr>
+              <w:jc w:val="center"/>
+              <w:rPr>
+                <w:rFonts w:ascii="Garamond" w:hAnsi="Garamond"/>
+                <w:sz w:val="24"/>
+                <w:szCs w:val="24"/>
+              </w:rPr>
+            </w:pPr>
+          </w:p>
+        </w:tc>
+        <w:tc>
+          <w:tcPr>
+            <w:tcW w:w="1193" w:type="dxa"/>
+          </w:tcPr>
+          <w:p>
+            <w:pPr>
+              <w:jc w:val="center"/>
+              <w:rPr>
+                <w:rFonts w:ascii="Garamond" w:hAnsi="Garamond"/>
+                <w:sz w:val="24"/>
+                <w:szCs w:val="24"/>
+              </w:rPr>
+            </w:pPr>
+          </w:p>
+        </w:tc>
+        <w:tc>
+          <w:tcPr>
+            <w:tcW w:w="1193" w:type="dxa"/>
+          </w:tcPr>
+          <w:p>
+            <w:pPr>
+              <w:jc w:val="center"/>
+              <w:rPr>
+                <w:rFonts w:ascii="Garamond" w:hAnsi="Garamond"/>
+                <w:sz w:val="24"/>
+                <w:szCs w:val="24"/>
+              </w:rPr>
+            </w:pPr>
+          </w:p>
+        </w:tc>
+        <w:tc>
+          <w:tcPr>
+            <w:tcW w:w="990" w:type="dxa"/>
+          </w:tcPr>
+          <w:p>
+            <w:pPr>
+              <w:rPr>
+                <w:rFonts w:ascii="Garamond" w:hAnsi="Garamond"/>
+                <w:sz w:val="24"/>
+                <w:szCs w:val="24"/>
+              </w:rPr>
+            </w:pPr>
+          </w:p>
+        </w:tc>
+      </w:tr>
+      <w:tr>
+        <w:trPr>
+          <w:jc w:val="center"/>
+        </w:trPr>
+        <w:tc>
+          <w:tcPr>
+            <w:tcW w:w="1169" w:type="dxa"/>
+          </w:tcPr>
+          <w:p>
+            <w:pPr>
+              <w:rPr>
+                <w:rFonts w:ascii="Garamond" w:hAnsi="Garamond"/>
+                <w:sz w:val="24"/>
+                <w:szCs w:val="24"/>
+              </w:rPr>
+            </w:pPr>
+            <w:r>
+              <w:rPr>
+                <w:rFonts w:ascii="Garamond" w:hAnsi="Garamond"/>
+                <w:sz w:val="24"/>
+                <w:szCs w:val="24"/>
+              </w:rPr>
+              <w:t>AMLR03</w:t>
+            </w:r>
+          </w:p>
+        </w:tc>
+        <w:tc>
+          <w:tcPr>
+            <w:tcW w:w="867" w:type="dxa"/>
+          </w:tcPr>
+          <w:p>
+            <w:pPr>
+              <w:jc w:val="center"/>
+              <w:rPr>
+                <w:rFonts w:ascii="Garamond" w:hAnsi="Garamond"/>
+                <w:sz w:val="24"/>
+                <w:szCs w:val="24"/>
+              </w:rPr>
+            </w:pPr>
+            <w:r>
+              <w:rPr>
+                <w:rFonts w:ascii="Garamond" w:hAnsi="Garamond"/>
+                <w:sz w:val="24"/>
+                <w:szCs w:val="24"/>
+              </w:rPr>
+              <w:t>43.54</w:t>
+            </w:r>
+          </w:p>
+        </w:tc>
+        <w:tc>
+          <w:tcPr>
+            <w:tcW w:w="1051" w:type="dxa"/>
+          </w:tcPr>
+          <w:p>
+            <w:pPr>
+              <w:jc w:val="center"/>
+              <w:rPr>
+                <w:rFonts w:ascii="Garamond" w:hAnsi="Garamond"/>
+                <w:sz w:val="24"/>
+                <w:szCs w:val="24"/>
+              </w:rPr>
+            </w:pPr>
+            <w:r>
+              <w:rPr>
+                <w:rFonts w:ascii="Garamond" w:hAnsi="Garamond"/>
+                <w:sz w:val="24"/>
+                <w:szCs w:val="24"/>
+              </w:rPr>
+              <w:t>141.48</w:t>
+            </w:r>
+          </w:p>
+        </w:tc>
+        <w:tc>
+          <w:tcPr>
+            <w:tcW w:w="1051" w:type="dxa"/>
+          </w:tcPr>
+          <w:p>
+            <w:pPr>
+              <w:jc w:val="center"/>
+              <w:rPr>
+                <w:rFonts w:ascii="Garamond" w:hAnsi="Garamond"/>
+                <w:sz w:val="24"/>
+                <w:szCs w:val="24"/>
+              </w:rPr>
+            </w:pPr>
+            <w:r>
+              <w:rPr>
+                <w:rFonts w:ascii="Garamond" w:hAnsi="Garamond"/>
+                <w:sz w:val="24"/>
+                <w:szCs w:val="24"/>
+              </w:rPr>
+              <w:t>3.9189e+05</w:t>
+            </w:r>
+          </w:p>
+        </w:tc>
+        <w:tc>
+          <w:tcPr>
+            <w:tcW w:w="867" w:type="dxa"/>
+          </w:tcPr>
+          <w:p>
+            <w:pPr>
+              <w:jc w:val="center"/>
+              <w:rPr>
+                <w:rFonts w:ascii="Garamond" w:hAnsi="Garamond"/>
+                <w:sz w:val="24"/>
+                <w:szCs w:val="24"/>
+              </w:rPr>
+            </w:pPr>
+            <w:r>
+              <w:rPr>
+                <w:rFonts w:ascii="Garamond" w:hAnsi="Garamond"/>
+                <w:sz w:val="24"/>
+                <w:szCs w:val="24"/>
+              </w:rPr>
+              <w:t>33.98</w:t>
+            </w:r>
+          </w:p>
+        </w:tc>
+        <w:tc>
+          <w:tcPr>
+            <w:tcW w:w="1193" w:type="dxa"/>
+          </w:tcPr>
+          <w:p>
+            <w:pPr>
+              <w:jc w:val="center"/>
+              <w:rPr>
+                <w:rFonts w:ascii="Garamond" w:hAnsi="Garamond"/>
+                <w:sz w:val="24"/>
+                <w:szCs w:val="24"/>
+              </w:rPr>
+            </w:pPr>
+            <w:r>
+              <w:rPr>
+                <w:rFonts w:ascii="Garamond" w:hAnsi="Garamond"/>
+                <w:sz w:val="24"/>
+                <w:szCs w:val="24"/>
+              </w:rPr>
+              <w:t>103.07</w:t>
+            </w:r>
+          </w:p>
+        </w:tc>
+        <w:tc>
+          <w:tcPr>
+            <w:tcW w:w="1193" w:type="dxa"/>
+          </w:tcPr>
+          <w:p>
+            <w:pPr>
+              <w:jc w:val="center"/>
+              <w:rPr>
+                <w:rFonts w:ascii="Garamond" w:hAnsi="Garamond"/>
+                <w:sz w:val="24"/>
+                <w:szCs w:val="24"/>
+              </w:rPr>
+            </w:pPr>
+            <w:r>
+              <w:rPr>
+                <w:rFonts w:ascii="Garamond" w:hAnsi="Garamond"/>
+                <w:sz w:val="24"/>
+                <w:szCs w:val="24"/>
+              </w:rPr>
+              <w:t>3.0586e+05</w:t>
+            </w:r>
+          </w:p>
+        </w:tc>
+        <w:tc>
+          <w:tcPr>
+            <w:tcW w:w="990" w:type="dxa"/>
+          </w:tcPr>
+          <w:p>
+            <w:pPr>
+              <w:rPr>
+                <w:rFonts w:ascii="Garamond" w:hAnsi="Garamond"/>
+                <w:sz w:val="24"/>
+                <w:szCs w:val="24"/>
+              </w:rPr>
+            </w:pPr>
+          </w:p>
+        </w:tc>
+      </w:tr>
+      <w:tr>
+        <w:trPr>
+          <w:jc w:val="center"/>
+        </w:trPr>
+        <w:tc>
+          <w:tcPr>
+            <w:tcW w:w="1169" w:type="dxa"/>
+          </w:tcPr>
+          <w:p>
+            <w:pPr>
+              <w:rPr>
+                <w:rFonts w:ascii="Garamond" w:hAnsi="Garamond"/>
+                <w:sz w:val="24"/>
+                <w:szCs w:val="24"/>
+              </w:rPr>
+            </w:pPr>
+            <w:r>
+              <w:rPr>
+                <w:rFonts w:ascii="Garamond" w:hAnsi="Garamond"/>
+                <w:sz w:val="24"/>
+                <w:szCs w:val="24"/>
+              </w:rPr>
+              <w:t>AMLR04</w:t>
+            </w:r>
+          </w:p>
+        </w:tc>
+        <w:tc>
+          <w:tcPr>
+            <w:tcW w:w="867" w:type="dxa"/>
+          </w:tcPr>
+          <w:p>
+            <w:pPr>
+              <w:jc w:val="center"/>
+              <w:rPr>
+                <w:rFonts w:ascii="Garamond" w:hAnsi="Garamond"/>
+                <w:sz w:val="24"/>
+                <w:szCs w:val="24"/>
+              </w:rPr>
+            </w:pPr>
+            <w:r>
+              <w:rPr>
+                <w:rFonts w:ascii="Garamond" w:hAnsi="Garamond"/>
+                <w:sz w:val="24"/>
+                <w:szCs w:val="24"/>
+              </w:rPr>
+              <w:t>33.46</w:t>
+            </w:r>
+          </w:p>
+        </w:tc>
+        <w:tc>
+          <w:tcPr>
+            <w:tcW w:w="1051" w:type="dxa"/>
+          </w:tcPr>
+          <w:p>
+            <w:pPr>
+              <w:jc w:val="center"/>
+              <w:rPr>
+                <w:rFonts w:ascii="Garamond" w:hAnsi="Garamond"/>
+                <w:sz w:val="24"/>
+                <w:szCs w:val="24"/>
+              </w:rPr>
+            </w:pPr>
+            <w:r>
+              <w:rPr>
+                <w:rFonts w:ascii="Garamond" w:hAnsi="Garamond"/>
+                <w:sz w:val="24"/>
+                <w:szCs w:val="24"/>
+              </w:rPr>
+              <w:t>93.89</w:t>
+            </w:r>
+          </w:p>
+        </w:tc>
+        <w:tc>
+          <w:tcPr>
+            <w:tcW w:w="1051" w:type="dxa"/>
+          </w:tcPr>
+          <w:p>
+            <w:pPr>
+              <w:jc w:val="center"/>
+              <w:rPr>
+                <w:rFonts w:ascii="Garamond" w:hAnsi="Garamond"/>
+                <w:sz w:val="24"/>
+                <w:szCs w:val="24"/>
+              </w:rPr>
+            </w:pPr>
+            <w:r>
+              <w:rPr>
+                <w:rFonts w:ascii="Garamond" w:hAnsi="Garamond"/>
+                <w:sz w:val="24"/>
+                <w:szCs w:val="24"/>
+              </w:rPr>
+              <w:t>3.0112e+05</w:t>
+            </w:r>
+          </w:p>
+        </w:tc>
+        <w:tc>
+          <w:tcPr>
+            <w:tcW w:w="867" w:type="dxa"/>
+          </w:tcPr>
+          <w:p>
+            <w:pPr>
+              <w:jc w:val="center"/>
+              <w:rPr>
+                <w:rFonts w:ascii="Garamond" w:hAnsi="Garamond"/>
+                <w:sz w:val="24"/>
+                <w:szCs w:val="24"/>
+              </w:rPr>
+            </w:pPr>
+            <w:r>
+              <w:rPr>
+                <w:rFonts w:ascii="Garamond" w:hAnsi="Garamond"/>
+                <w:sz w:val="24"/>
+                <w:szCs w:val="24"/>
+              </w:rPr>
+              <w:t>31.96</w:t>
+            </w:r>
+          </w:p>
+        </w:tc>
+        <w:tc>
+          <w:tcPr>
+            <w:tcW w:w="1193" w:type="dxa"/>
+          </w:tcPr>
+          <w:p>
+            <w:pPr>
+              <w:jc w:val="center"/>
+              <w:rPr>
+                <w:rFonts w:ascii="Garamond" w:hAnsi="Garamond"/>
+                <w:sz w:val="24"/>
+                <w:szCs w:val="24"/>
+              </w:rPr>
+            </w:pPr>
+            <w:r>
+              <w:rPr>
+                <w:rFonts w:ascii="Garamond" w:hAnsi="Garamond"/>
+                <w:sz w:val="24"/>
+                <w:szCs w:val="24"/>
+              </w:rPr>
+              <w:t>91.71</w:t>
+            </w:r>
+          </w:p>
+        </w:tc>
+        <w:tc>
+          <w:tcPr>
+            <w:tcW w:w="1193" w:type="dxa"/>
+          </w:tcPr>
+          <w:p>
+            <w:pPr>
+              <w:jc w:val="center"/>
+              <w:rPr>
+                <w:rFonts w:ascii="Garamond" w:hAnsi="Garamond"/>
+                <w:sz w:val="24"/>
+                <w:szCs w:val="24"/>
+              </w:rPr>
+            </w:pPr>
+            <w:r>
+              <w:rPr>
+                <w:rFonts w:ascii="Garamond" w:hAnsi="Garamond"/>
+                <w:sz w:val="24"/>
+                <w:szCs w:val="24"/>
+              </w:rPr>
+              <w:t>2.8762e+05</w:t>
+            </w:r>
+          </w:p>
+        </w:tc>
+        <w:tc>
+          <w:tcPr>
+            <w:tcW w:w="990" w:type="dxa"/>
+          </w:tcPr>
+          <w:p>
+            <w:pPr>
+              <w:rPr>
+                <w:rFonts w:ascii="Garamond" w:hAnsi="Garamond"/>
+                <w:sz w:val="24"/>
+                <w:szCs w:val="24"/>
+              </w:rPr>
+            </w:pPr>
           </w:p>
         </w:tc>
       </w:tr>
@@ -9215,6 +9328,74 @@
       </w:tblBorders>
     </w:tblPr>
   </w:style>
+  <w:style w:type="character" w:styleId="CommentReference">
+    <w:name w:val="annotation reference"/>
+    <w:basedOn w:val="DefaultParagraphFont"/>
+    <w:uiPriority w:val="99"/>
+    <w:semiHidden/>
+    <w:unhideWhenUsed/>
+    <w:rsid w:val="00C5612F"/>
+    <w:rPr>
+      <w:sz w:val="16"/>
+      <w:szCs w:val="16"/>
+    </w:rPr>
+  </w:style>
+  <w:style w:type="paragraph" w:styleId="CommentText">
+    <w:name w:val="annotation text"/>
+    <w:basedOn w:val="Normal"/>
+    <w:link w:val="CommentTextChar"/>
+    <w:uiPriority w:val="99"/>
+    <w:semiHidden/>
+    <w:unhideWhenUsed/>
+    <w:rsid w:val="00C5612F"/>
+    <w:pPr>
+      <w:spacing w:line="240" w:lineRule="auto"/>
+    </w:pPr>
+    <w:rPr>
+      <w:sz w:val="20"/>
+      <w:szCs w:val="20"/>
+    </w:rPr>
+  </w:style>
+  <w:style w:type="character" w:customStyle="1" w:styleId="CommentTextChar">
+    <w:name w:val="Comment Text Char"/>
+    <w:basedOn w:val="DefaultParagraphFont"/>
+    <w:link w:val="CommentText"/>
+    <w:uiPriority w:val="99"/>
+    <w:semiHidden/>
+    <w:rsid w:val="00C5612F"/>
+    <w:rPr>
+      <w:sz w:val="20"/>
+      <w:szCs w:val="20"/>
+    </w:rPr>
+  </w:style>
+  <w:style w:type="paragraph" w:styleId="CommentSubject">
+    <w:name w:val="annotation subject"/>
+    <w:basedOn w:val="CommentText"/>
+    <w:next w:val="CommentText"/>
+    <w:link w:val="CommentSubjectChar"/>
+    <w:uiPriority w:val="99"/>
+    <w:semiHidden/>
+    <w:unhideWhenUsed/>
+    <w:rsid w:val="00C5612F"/>
+    <w:rPr>
+      <w:b/>
+      <w:bCs/>
+    </w:rPr>
+  </w:style>
+  <w:style w:type="character" w:customStyle="1" w:styleId="CommentSubjectChar">
+    <w:name w:val="Comment Subject Char"/>
+    <w:basedOn w:val="CommentTextChar"/>
+    <w:link w:val="CommentSubject"/>
+    <w:uiPriority w:val="99"/>
+    <w:semiHidden/>
+    <w:rsid w:val="00C5612F"/>
+    <w:rPr>
+      <w:b/>
+      <w:bCs/>
+      <w:sz w:val="20"/>
+      <w:szCs w:val="20"/>
+    </w:rPr>
+  </w:style>
 </w:styles>
 </file>
 

</xml_diff>

<commit_message>
updated tables.doc with schools to 250m
</commit_message>
<xml_diff>
--- a/figures/Tables.docx
+++ b/figures/Tables.docx
@@ -3895,6 +3895,14 @@
           <w:sz w:val="24"/>
           <w:szCs w:val="24"/>
         </w:rPr>
+        <w:t xml:space="preserve"> to 250m</w:t>
+      </w:r>
+      <w:r>
+        <w:rPr>
+          <w:rFonts w:ascii="Garamond" w:hAnsi="Garamond"/>
+          <w:sz w:val="24"/>
+          <w:szCs w:val="24"/>
+        </w:rPr>
         <w:t>.</w:t>
       </w:r>
     </w:p>
@@ -4352,6 +4360,14 @@
                 <w:szCs w:val="24"/>
               </w:rPr>
             </w:pPr>
+            <w:r>
+              <w:rPr>
+                <w:rFonts w:ascii="Garamond" w:hAnsi="Garamond"/>
+                <w:sz w:val="24"/>
+                <w:szCs w:val="24"/>
+              </w:rPr>
+              <w:t>635</w:t>
+            </w:r>
           </w:p>
         </w:tc>
       </w:tr>
@@ -4532,6 +4548,14 @@
                 <w:szCs w:val="24"/>
               </w:rPr>
             </w:pPr>
+            <w:r>
+              <w:rPr>
+                <w:rFonts w:ascii="Garamond" w:hAnsi="Garamond"/>
+                <w:sz w:val="24"/>
+                <w:szCs w:val="24"/>
+              </w:rPr>
+              <w:t>515</w:t>
+            </w:r>
           </w:p>
         </w:tc>
       </w:tr>
@@ -5996,6 +6020,7 @@
                 <w:sz w:val="24"/>
                 <w:szCs w:val="24"/>
               </w:rPr>
+              <w:lastRenderedPageBreak/>
               <w:t>Schools</w:t>
             </w:r>
           </w:p>
@@ -6134,7 +6159,6 @@
                 <w:sz w:val="24"/>
                 <w:szCs w:val="24"/>
               </w:rPr>
-              <w:lastRenderedPageBreak/>
               <w:t>AMLR03</w:t>
             </w:r>
           </w:p>
@@ -8199,6 +8223,14 @@
                 <w:szCs w:val="24"/>
               </w:rPr>
             </w:pPr>
+            <w:r>
+              <w:rPr>
+                <w:rFonts w:ascii="Garamond" w:hAnsi="Garamond"/>
+                <w:sz w:val="24"/>
+                <w:szCs w:val="24"/>
+              </w:rPr>
+              <w:t>561</w:t>
+            </w:r>
           </w:p>
         </w:tc>
       </w:tr>
@@ -8378,6 +8410,14 @@
                 <w:szCs w:val="24"/>
               </w:rPr>
             </w:pPr>
+            <w:r>
+              <w:rPr>
+                <w:rFonts w:ascii="Garamond" w:hAnsi="Garamond"/>
+                <w:sz w:val="24"/>
+                <w:szCs w:val="24"/>
+              </w:rPr>
+              <w:t>563</w:t>
+            </w:r>
           </w:p>
         </w:tc>
       </w:tr>

</xml_diff>

<commit_message>
updates to NewPaper, added full grid figs
</commit_message>
<xml_diff>
--- a/figures/Tables.docx
+++ b/figures/Tables.docx
@@ -7765,7 +7765,7 @@
         <w:gridCol w:w="1316"/>
         <w:gridCol w:w="881"/>
         <w:gridCol w:w="1193"/>
-        <w:gridCol w:w="1316"/>
+        <w:gridCol w:w="1331"/>
         <w:gridCol w:w="990"/>
       </w:tblGrid>
       <w:tr>
@@ -7982,7 +7982,23 @@
                 <w:sz w:val="24"/>
                 <w:szCs w:val="24"/>
               </w:rPr>
-              <w:t>120 kHz biomass</w:t>
+              <w:t xml:space="preserve">120 kHz </w:t>
+            </w:r>
+            <w:commentRangeStart w:id="0"/>
+            <w:r>
+              <w:rPr>
+                <w:rFonts w:ascii="Garamond" w:hAnsi="Garamond"/>
+                <w:sz w:val="24"/>
+                <w:szCs w:val="24"/>
+              </w:rPr>
+              <w:t>biomass</w:t>
+            </w:r>
+            <w:commentRangeEnd w:id="0"/>
+            <w:r>
+              <w:rPr>
+                <w:rStyle w:val="CommentReference"/>
+              </w:rPr>
+              <w:commentReference w:id="0"/>
             </w:r>
           </w:p>
           <w:p>
@@ -8920,6 +8936,65 @@
     </w:sectPr>
   </w:body>
 </w:document>
+</file>
+
+<file path=word/comments.xml><?xml version="1.0" encoding="utf-8"?>
+<w:comments xmlns:wpc="http://schemas.microsoft.com/office/word/2010/wordprocessingCanvas" xmlns:cx="http://schemas.microsoft.com/office/drawing/2014/chartex" xmlns:cx1="http://schemas.microsoft.com/office/drawing/2015/9/8/chartex" xmlns:cx2="http://schemas.microsoft.com/office/drawing/2015/10/21/chartex" xmlns:cx3="http://schemas.microsoft.com/office/drawing/2016/5/9/chartex" xmlns:cx4="http://schemas.microsoft.com/office/drawing/2016/5/10/chartex" xmlns:cx5="http://schemas.microsoft.com/office/drawing/2016/5/11/chartex" xmlns:cx6="http://schemas.microsoft.com/office/drawing/2016/5/12/chartex" xmlns:cx7="http://schemas.microsoft.com/office/drawing/2016/5/13/chartex" xmlns:cx8="http://schemas.microsoft.com/office/drawing/2016/5/14/chartex" xmlns:mc="http://schemas.openxmlformats.org/markup-compatibility/2006" xmlns:aink="http://schemas.microsoft.com/office/drawing/2016/ink" xmlns:am3d="http://schemas.microsoft.com/office/drawing/2017/model3d" xmlns:o="urn:schemas-microsoft-com:office:office" xmlns:r="http://schemas.openxmlformats.org/officeDocument/2006/relationships" xmlns:m="http://schemas.openxmlformats.org/officeDocument/2006/math" xmlns:v="urn:schemas-microsoft-com:vml" xmlns:wp14="http://schemas.microsoft.com/office/word/2010/wordprocessingDrawing" xmlns:wp="http://schemas.openxmlformats.org/drawingml/2006/wordprocessingDrawing" xmlns:w10="urn:schemas-microsoft-com:office:word" xmlns:w="http://schemas.openxmlformats.org/wordprocessingml/2006/main" xmlns:w14="http://schemas.microsoft.com/office/word/2010/wordml" xmlns:w15="http://schemas.microsoft.com/office/word/2012/wordml" xmlns:w16cex="http://schemas.microsoft.com/office/word/2018/wordml/cex" xmlns:w16cid="http://schemas.microsoft.com/office/word/2016/wordml/cid" xmlns:w16="http://schemas.microsoft.com/office/word/2018/wordml" xmlns:w16sdtdh="http://schemas.microsoft.com/office/word/2020/wordml/sdtdatahash" xmlns:w16se="http://schemas.microsoft.com/office/word/2015/wordml/symex" xmlns:wpg="http://schemas.microsoft.com/office/word/2010/wordprocessingGroup" xmlns:wpi="http://schemas.microsoft.com/office/word/2010/wordprocessingInk" xmlns:wne="http://schemas.microsoft.com/office/word/2006/wordml" xmlns:wps="http://schemas.microsoft.com/office/word/2010/wordprocessingShape" mc:Ignorable="w14 w15 w16se w16cid w16 w16cex w16sdtdh wp14">
+  <w:comment w:id="0" w:author="Anthony Cossio" w:date="2025-05-27T16:06:00Z" w:initials="AC">
+    <w:p>
+      <w:pPr>
+        <w:pStyle w:val="CommentText"/>
+      </w:pPr>
+      <w:r>
+        <w:rPr>
+          <w:rStyle w:val="CommentReference"/>
+        </w:rPr>
+        <w:annotationRef/>
+      </w:r>
+      <w:r>
+        <w:t xml:space="preserve">The same area is used to calculate both this and the survey. May need to </w:t>
+      </w:r>
+      <w:r>
+        <w:t>change</w:t>
+      </w:r>
+      <w:r>
+        <w:t xml:space="preserve"> the area</w:t>
+      </w:r>
+      <w:r>
+        <w:t xml:space="preserve"> for entire data set</w:t>
+      </w:r>
+      <w:r>
+        <w:t>.</w:t>
+      </w:r>
+    </w:p>
+  </w:comment>
+</w:comments>
+</file>
+
+<file path=word/commentsExtended.xml><?xml version="1.0" encoding="utf-8"?>
+<w15:commentsEx xmlns:wpc="http://schemas.microsoft.com/office/word/2010/wordprocessingCanvas" xmlns:cx="http://schemas.microsoft.com/office/drawing/2014/chartex" xmlns:cx1="http://schemas.microsoft.com/office/drawing/2015/9/8/chartex" xmlns:cx2="http://schemas.microsoft.com/office/drawing/2015/10/21/chartex" xmlns:cx3="http://schemas.microsoft.com/office/drawing/2016/5/9/chartex" xmlns:cx4="http://schemas.microsoft.com/office/drawing/2016/5/10/chartex" xmlns:cx5="http://schemas.microsoft.com/office/drawing/2016/5/11/chartex" xmlns:cx6="http://schemas.microsoft.com/office/drawing/2016/5/12/chartex" xmlns:cx7="http://schemas.microsoft.com/office/drawing/2016/5/13/chartex" xmlns:cx8="http://schemas.microsoft.com/office/drawing/2016/5/14/chartex" xmlns:mc="http://schemas.openxmlformats.org/markup-compatibility/2006" xmlns:aink="http://schemas.microsoft.com/office/drawing/2016/ink" xmlns:am3d="http://schemas.microsoft.com/office/drawing/2017/model3d" xmlns:o="urn:schemas-microsoft-com:office:office" xmlns:r="http://schemas.openxmlformats.org/officeDocument/2006/relationships" xmlns:m="http://schemas.openxmlformats.org/officeDocument/2006/math" xmlns:v="urn:schemas-microsoft-com:vml" xmlns:wp14="http://schemas.microsoft.com/office/word/2010/wordprocessingDrawing" xmlns:wp="http://schemas.openxmlformats.org/drawingml/2006/wordprocessingDrawing" xmlns:w10="urn:schemas-microsoft-com:office:word" xmlns:w="http://schemas.openxmlformats.org/wordprocessingml/2006/main" xmlns:w14="http://schemas.microsoft.com/office/word/2010/wordml" xmlns:w15="http://schemas.microsoft.com/office/word/2012/wordml" xmlns:w16cex="http://schemas.microsoft.com/office/word/2018/wordml/cex" xmlns:w16cid="http://schemas.microsoft.com/office/word/2016/wordml/cid" xmlns:w16="http://schemas.microsoft.com/office/word/2018/wordml" xmlns:w16sdtdh="http://schemas.microsoft.com/office/word/2020/wordml/sdtdatahash" xmlns:w16se="http://schemas.microsoft.com/office/word/2015/wordml/symex" xmlns:wpg="http://schemas.microsoft.com/office/word/2010/wordprocessingGroup" xmlns:wpi="http://schemas.microsoft.com/office/word/2010/wordprocessingInk" xmlns:wne="http://schemas.microsoft.com/office/word/2006/wordml" xmlns:wps="http://schemas.microsoft.com/office/word/2010/wordprocessingShape" mc:Ignorable="w14 w15 w16se w16cid w16 w16cex w16sdtdh wp14">
+  <w15:commentEx w15:paraId="2200D1D0" w15:done="0"/>
+</w15:commentsEx>
+</file>
+
+<file path=word/commentsExtensible.xml><?xml version="1.0" encoding="utf-8"?>
+<w16cex:commentsExtensible xmlns:wpc="http://schemas.microsoft.com/office/word/2010/wordprocessingCanvas" xmlns:cx="http://schemas.microsoft.com/office/drawing/2014/chartex" xmlns:cx1="http://schemas.microsoft.com/office/drawing/2015/9/8/chartex" xmlns:cx2="http://schemas.microsoft.com/office/drawing/2015/10/21/chartex" xmlns:cx3="http://schemas.microsoft.com/office/drawing/2016/5/9/chartex" xmlns:cx4="http://schemas.microsoft.com/office/drawing/2016/5/10/chartex" xmlns:cx5="http://schemas.microsoft.com/office/drawing/2016/5/11/chartex" xmlns:cx6="http://schemas.microsoft.com/office/drawing/2016/5/12/chartex" xmlns:cx7="http://schemas.microsoft.com/office/drawing/2016/5/13/chartex" xmlns:cx8="http://schemas.microsoft.com/office/drawing/2016/5/14/chartex" xmlns:mc="http://schemas.openxmlformats.org/markup-compatibility/2006" xmlns:aink="http://schemas.microsoft.com/office/drawing/2016/ink" xmlns:am3d="http://schemas.microsoft.com/office/drawing/2017/model3d" xmlns:o="urn:schemas-microsoft-com:office:office" xmlns:r="http://schemas.openxmlformats.org/officeDocument/2006/relationships" xmlns:m="http://schemas.openxmlformats.org/officeDocument/2006/math" xmlns:v="urn:schemas-microsoft-com:vml" xmlns:wp14="http://schemas.microsoft.com/office/word/2010/wordprocessingDrawing" xmlns:wp="http://schemas.openxmlformats.org/drawingml/2006/wordprocessingDrawing" xmlns:w10="urn:schemas-microsoft-com:office:word" xmlns:w="http://schemas.openxmlformats.org/wordprocessingml/2006/main" xmlns:w14="http://schemas.microsoft.com/office/word/2010/wordml" xmlns:w15="http://schemas.microsoft.com/office/word/2012/wordml" xmlns:w16cex="http://schemas.microsoft.com/office/word/2018/wordml/cex" xmlns:w16cid="http://schemas.microsoft.com/office/word/2016/wordml/cid" xmlns:w16="http://schemas.microsoft.com/office/word/2018/wordml" xmlns:w16sdtdh="http://schemas.microsoft.com/office/word/2020/wordml/sdtdatahash" xmlns:w16se="http://schemas.microsoft.com/office/word/2015/wordml/symex" xmlns:wpg="http://schemas.microsoft.com/office/word/2010/wordprocessingGroup" xmlns:wpi="http://schemas.microsoft.com/office/word/2010/wordprocessingInk" xmlns:wne="http://schemas.microsoft.com/office/word/2006/wordml" xmlns:wps="http://schemas.microsoft.com/office/word/2010/wordprocessingShape" mc:Ignorable="w14 w15 w16se w16cid w16 w16cex w16sdtdh wp14">
+  <w16cex:commentExtensible w16cex:durableId="2BE0618C" w16cex:dateUtc="2025-05-27T23:06:00Z"/>
+</w16cex:commentsExtensible>
+</file>
+
+<file path=word/commentsIds.xml><?xml version="1.0" encoding="utf-8"?>
+<w16cid:commentsIds xmlns:wpc="http://schemas.microsoft.com/office/word/2010/wordprocessingCanvas" xmlns:cx="http://schemas.microsoft.com/office/drawing/2014/chartex" xmlns:cx1="http://schemas.microsoft.com/office/drawing/2015/9/8/chartex" xmlns:cx2="http://schemas.microsoft.com/office/drawing/2015/10/21/chartex" xmlns:cx3="http://schemas.microsoft.com/office/drawing/2016/5/9/chartex" xmlns:cx4="http://schemas.microsoft.com/office/drawing/2016/5/10/chartex" xmlns:cx5="http://schemas.microsoft.com/office/drawing/2016/5/11/chartex" xmlns:cx6="http://schemas.microsoft.com/office/drawing/2016/5/12/chartex" xmlns:cx7="http://schemas.microsoft.com/office/drawing/2016/5/13/chartex" xmlns:cx8="http://schemas.microsoft.com/office/drawing/2016/5/14/chartex" xmlns:mc="http://schemas.openxmlformats.org/markup-compatibility/2006" xmlns:aink="http://schemas.microsoft.com/office/drawing/2016/ink" xmlns:am3d="http://schemas.microsoft.com/office/drawing/2017/model3d" xmlns:o="urn:schemas-microsoft-com:office:office" xmlns:r="http://schemas.openxmlformats.org/officeDocument/2006/relationships" xmlns:m="http://schemas.openxmlformats.org/officeDocument/2006/math" xmlns:v="urn:schemas-microsoft-com:vml" xmlns:wp14="http://schemas.microsoft.com/office/word/2010/wordprocessingDrawing" xmlns:wp="http://schemas.openxmlformats.org/drawingml/2006/wordprocessingDrawing" xmlns:w10="urn:schemas-microsoft-com:office:word" xmlns:w="http://schemas.openxmlformats.org/wordprocessingml/2006/main" xmlns:w14="http://schemas.microsoft.com/office/word/2010/wordml" xmlns:w15="http://schemas.microsoft.com/office/word/2012/wordml" xmlns:w16cex="http://schemas.microsoft.com/office/word/2018/wordml/cex" xmlns:w16cid="http://schemas.microsoft.com/office/word/2016/wordml/cid" xmlns:w16="http://schemas.microsoft.com/office/word/2018/wordml" xmlns:w16sdtdh="http://schemas.microsoft.com/office/word/2020/wordml/sdtdatahash" xmlns:w16se="http://schemas.microsoft.com/office/word/2015/wordml/symex" xmlns:wpg="http://schemas.microsoft.com/office/word/2010/wordprocessingGroup" xmlns:wpi="http://schemas.microsoft.com/office/word/2010/wordprocessingInk" xmlns:wne="http://schemas.microsoft.com/office/word/2006/wordml" xmlns:wps="http://schemas.microsoft.com/office/word/2010/wordprocessingShape" mc:Ignorable="w14 w15 w16se w16cid w16 w16cex w16sdtdh wp14">
+  <w16cid:commentId w16cid:paraId="2200D1D0" w16cid:durableId="2BE0618C"/>
+</w16cid:commentsIds>
+</file>
+
+<file path=word/people.xml><?xml version="1.0" encoding="utf-8"?>
+<w15:people xmlns:wpc="http://schemas.microsoft.com/office/word/2010/wordprocessingCanvas" xmlns:cx="http://schemas.microsoft.com/office/drawing/2014/chartex" xmlns:cx1="http://schemas.microsoft.com/office/drawing/2015/9/8/chartex" xmlns:cx2="http://schemas.microsoft.com/office/drawing/2015/10/21/chartex" xmlns:cx3="http://schemas.microsoft.com/office/drawing/2016/5/9/chartex" xmlns:cx4="http://schemas.microsoft.com/office/drawing/2016/5/10/chartex" xmlns:cx5="http://schemas.microsoft.com/office/drawing/2016/5/11/chartex" xmlns:cx6="http://schemas.microsoft.com/office/drawing/2016/5/12/chartex" xmlns:cx7="http://schemas.microsoft.com/office/drawing/2016/5/13/chartex" xmlns:cx8="http://schemas.microsoft.com/office/drawing/2016/5/14/chartex" xmlns:mc="http://schemas.openxmlformats.org/markup-compatibility/2006" xmlns:aink="http://schemas.microsoft.com/office/drawing/2016/ink" xmlns:am3d="http://schemas.microsoft.com/office/drawing/2017/model3d" xmlns:o="urn:schemas-microsoft-com:office:office" xmlns:r="http://schemas.openxmlformats.org/officeDocument/2006/relationships" xmlns:m="http://schemas.openxmlformats.org/officeDocument/2006/math" xmlns:v="urn:schemas-microsoft-com:vml" xmlns:wp14="http://schemas.microsoft.com/office/word/2010/wordprocessingDrawing" xmlns:wp="http://schemas.openxmlformats.org/drawingml/2006/wordprocessingDrawing" xmlns:w10="urn:schemas-microsoft-com:office:word" xmlns:w="http://schemas.openxmlformats.org/wordprocessingml/2006/main" xmlns:w14="http://schemas.microsoft.com/office/word/2010/wordml" xmlns:w15="http://schemas.microsoft.com/office/word/2012/wordml" xmlns:w16cex="http://schemas.microsoft.com/office/word/2018/wordml/cex" xmlns:w16cid="http://schemas.microsoft.com/office/word/2016/wordml/cid" xmlns:w16="http://schemas.microsoft.com/office/word/2018/wordml" xmlns:w16sdtdh="http://schemas.microsoft.com/office/word/2020/wordml/sdtdatahash" xmlns:w16se="http://schemas.microsoft.com/office/word/2015/wordml/symex" xmlns:wpg="http://schemas.microsoft.com/office/word/2010/wordprocessingGroup" xmlns:wpi="http://schemas.microsoft.com/office/word/2010/wordprocessingInk" xmlns:wne="http://schemas.microsoft.com/office/word/2006/wordml" xmlns:wps="http://schemas.microsoft.com/office/word/2010/wordprocessingShape" mc:Ignorable="w14 w15 w16se w16cid w16 w16cex w16sdtdh wp14">
+  <w15:person w15:author="Anthony Cossio">
+    <w15:presenceInfo w15:providerId="AD" w15:userId="S-1-5-21-1625102663-4013227018-1311561448-37967"/>
+  </w15:person>
+</w15:people>
 </file>
 
 <file path=word/styles.xml><?xml version="1.0" encoding="utf-8"?>

</xml_diff>

<commit_message>
updates to NewPaper and biomass_calcs
</commit_message>
<xml_diff>
--- a/figures/Tables.docx
+++ b/figures/Tables.docx
@@ -4587,709 +4587,6 @@
         </w:rPr>
       </w:pPr>
     </w:p>
-    <w:p>
-      <w:pPr>
-        <w:rPr>
-          <w:rFonts w:ascii="Garamond" w:hAnsi="Garamond"/>
-          <w:strike/>
-          <w:sz w:val="24"/>
-          <w:szCs w:val="24"/>
-        </w:rPr>
-      </w:pPr>
-      <w:r>
-        <w:rPr>
-          <w:rFonts w:ascii="Garamond" w:hAnsi="Garamond"/>
-          <w:strike/>
-          <w:sz w:val="24"/>
-          <w:szCs w:val="24"/>
-        </w:rPr>
-        <w:t>Table 5. Table of bootstrapped densities with lower and upper confidence intervals and the number of binned data samples.</w:t>
-      </w:r>
-      <w:r>
-        <w:rPr>
-          <w:rFonts w:ascii="Garamond" w:hAnsi="Garamond"/>
-          <w:strike/>
-          <w:sz w:val="24"/>
-          <w:szCs w:val="24"/>
-        </w:rPr>
-        <w:t xml:space="preserve">  </w:t>
-      </w:r>
-      <w:r>
-        <w:rPr>
-          <w:rFonts w:ascii="Garamond" w:hAnsi="Garamond"/>
-          <w:strike/>
-          <w:sz w:val="24"/>
-          <w:szCs w:val="24"/>
-          <w:highlight w:val="yellow"/>
-        </w:rPr>
-        <w:t>grid_ll.1_lt_.1</w:t>
-      </w:r>
-    </w:p>
-    <w:p>
-      <w:pPr>
-        <w:rPr>
-          <w:rFonts w:ascii="Garamond" w:hAnsi="Garamond"/>
-          <w:strike/>
-          <w:sz w:val="24"/>
-          <w:szCs w:val="24"/>
-        </w:rPr>
-      </w:pPr>
-    </w:p>
-    <w:tbl>
-      <w:tblPr>
-        <w:tblStyle w:val="TableGrid"/>
-        <w:tblW w:w="0" w:type="auto"/>
-        <w:jc w:val="center"/>
-        <w:tblLook w:val="04A0" w:firstRow="1" w:lastRow="0" w:firstColumn="1" w:lastColumn="0" w:noHBand="0" w:noVBand="1"/>
-      </w:tblPr>
-      <w:tblGrid>
-        <w:gridCol w:w="1594"/>
-        <w:gridCol w:w="1200"/>
-        <w:gridCol w:w="1200"/>
-        <w:gridCol w:w="1200"/>
-        <w:gridCol w:w="1200"/>
-        <w:gridCol w:w="960"/>
-        <w:gridCol w:w="960"/>
-        <w:gridCol w:w="1007"/>
-      </w:tblGrid>
-      <w:tr>
-        <w:trPr>
-          <w:trHeight w:val="288"/>
-          <w:jc w:val="center"/>
-        </w:trPr>
-        <w:tc>
-          <w:tcPr>
-            <w:tcW w:w="1594" w:type="dxa"/>
-            <w:noWrap/>
-            <w:hideMark/>
-          </w:tcPr>
-          <w:p>
-            <w:pPr>
-              <w:rPr>
-                <w:rFonts w:ascii="Garamond" w:hAnsi="Garamond"/>
-                <w:strike/>
-                <w:sz w:val="24"/>
-                <w:szCs w:val="24"/>
-              </w:rPr>
-            </w:pPr>
-            <w:r>
-              <w:rPr>
-                <w:rFonts w:ascii="Garamond" w:hAnsi="Garamond"/>
-                <w:strike/>
-                <w:sz w:val="24"/>
-                <w:szCs w:val="24"/>
-              </w:rPr>
-              <w:t>Glider</w:t>
-            </w:r>
-          </w:p>
-        </w:tc>
-        <w:tc>
-          <w:tcPr>
-            <w:tcW w:w="1200" w:type="dxa"/>
-            <w:noWrap/>
-            <w:hideMark/>
-          </w:tcPr>
-          <w:p>
-            <w:pPr>
-              <w:jc w:val="center"/>
-              <w:rPr>
-                <w:rFonts w:ascii="Garamond" w:hAnsi="Garamond"/>
-                <w:strike/>
-                <w:sz w:val="24"/>
-                <w:szCs w:val="24"/>
-              </w:rPr>
-            </w:pPr>
-            <w:r>
-              <w:rPr>
-                <w:rFonts w:ascii="Garamond" w:hAnsi="Garamond"/>
-                <w:strike/>
-                <w:sz w:val="24"/>
-                <w:szCs w:val="24"/>
-              </w:rPr>
-              <w:t>70 kHz density</w:t>
-            </w:r>
-          </w:p>
-        </w:tc>
-        <w:tc>
-          <w:tcPr>
-            <w:tcW w:w="1200" w:type="dxa"/>
-          </w:tcPr>
-          <w:p>
-            <w:pPr>
-              <w:jc w:val="center"/>
-              <w:rPr>
-                <w:rFonts w:ascii="Garamond" w:hAnsi="Garamond"/>
-                <w:strike/>
-                <w:sz w:val="24"/>
-                <w:szCs w:val="24"/>
-              </w:rPr>
-            </w:pPr>
-            <w:r>
-              <w:rPr>
-                <w:rFonts w:ascii="Garamond" w:hAnsi="Garamond"/>
-                <w:strike/>
-                <w:sz w:val="24"/>
-                <w:szCs w:val="24"/>
-              </w:rPr>
-              <w:t>Lower CI</w:t>
-            </w:r>
-          </w:p>
-        </w:tc>
-        <w:tc>
-          <w:tcPr>
-            <w:tcW w:w="1200" w:type="dxa"/>
-            <w:noWrap/>
-            <w:hideMark/>
-          </w:tcPr>
-          <w:p>
-            <w:pPr>
-              <w:jc w:val="center"/>
-              <w:rPr>
-                <w:rFonts w:ascii="Garamond" w:hAnsi="Garamond"/>
-                <w:strike/>
-                <w:sz w:val="24"/>
-                <w:szCs w:val="24"/>
-              </w:rPr>
-            </w:pPr>
-            <w:r>
-              <w:rPr>
-                <w:rFonts w:ascii="Garamond" w:hAnsi="Garamond"/>
-                <w:strike/>
-                <w:sz w:val="24"/>
-                <w:szCs w:val="24"/>
-              </w:rPr>
-              <w:t>Upper CI</w:t>
-            </w:r>
-          </w:p>
-        </w:tc>
-        <w:tc>
-          <w:tcPr>
-            <w:tcW w:w="1200" w:type="dxa"/>
-            <w:noWrap/>
-            <w:hideMark/>
-          </w:tcPr>
-          <w:p>
-            <w:pPr>
-              <w:jc w:val="center"/>
-              <w:rPr>
-                <w:rFonts w:ascii="Garamond" w:hAnsi="Garamond"/>
-                <w:strike/>
-                <w:sz w:val="24"/>
-                <w:szCs w:val="24"/>
-              </w:rPr>
-            </w:pPr>
-            <w:r>
-              <w:rPr>
-                <w:rFonts w:ascii="Garamond" w:hAnsi="Garamond"/>
-                <w:strike/>
-                <w:sz w:val="24"/>
-                <w:szCs w:val="24"/>
-              </w:rPr>
-              <w:t>120 kHz density</w:t>
-            </w:r>
-          </w:p>
-        </w:tc>
-        <w:tc>
-          <w:tcPr>
-            <w:tcW w:w="960" w:type="dxa"/>
-          </w:tcPr>
-          <w:p>
-            <w:pPr>
-              <w:jc w:val="center"/>
-              <w:rPr>
-                <w:rFonts w:ascii="Garamond" w:hAnsi="Garamond"/>
-                <w:strike/>
-                <w:sz w:val="24"/>
-                <w:szCs w:val="24"/>
-              </w:rPr>
-            </w:pPr>
-            <w:r>
-              <w:rPr>
-                <w:rFonts w:ascii="Garamond" w:hAnsi="Garamond"/>
-                <w:strike/>
-                <w:sz w:val="24"/>
-                <w:szCs w:val="24"/>
-              </w:rPr>
-              <w:t>Lower CI</w:t>
-            </w:r>
-          </w:p>
-        </w:tc>
-        <w:tc>
-          <w:tcPr>
-            <w:tcW w:w="960" w:type="dxa"/>
-            <w:noWrap/>
-            <w:hideMark/>
-          </w:tcPr>
-          <w:p>
-            <w:pPr>
-              <w:jc w:val="center"/>
-              <w:rPr>
-                <w:rFonts w:ascii="Garamond" w:hAnsi="Garamond"/>
-                <w:strike/>
-                <w:sz w:val="24"/>
-                <w:szCs w:val="24"/>
-              </w:rPr>
-            </w:pPr>
-            <w:r>
-              <w:rPr>
-                <w:rFonts w:ascii="Garamond" w:hAnsi="Garamond"/>
-                <w:strike/>
-                <w:sz w:val="24"/>
-                <w:szCs w:val="24"/>
-              </w:rPr>
-              <w:t>Upper CI</w:t>
-            </w:r>
-          </w:p>
-        </w:tc>
-        <w:tc>
-          <w:tcPr>
-            <w:tcW w:w="960" w:type="dxa"/>
-          </w:tcPr>
-          <w:p>
-            <w:pPr>
-              <w:jc w:val="center"/>
-              <w:rPr>
-                <w:rFonts w:ascii="Garamond" w:hAnsi="Garamond"/>
-                <w:strike/>
-                <w:sz w:val="24"/>
-                <w:szCs w:val="24"/>
-              </w:rPr>
-            </w:pPr>
-            <w:r>
-              <w:rPr>
-                <w:rFonts w:ascii="Garamond" w:hAnsi="Garamond"/>
-                <w:strike/>
-                <w:sz w:val="24"/>
-                <w:szCs w:val="24"/>
-              </w:rPr>
-              <w:t>Number of samples</w:t>
-            </w:r>
-          </w:p>
-        </w:tc>
-      </w:tr>
-      <w:tr>
-        <w:trPr>
-          <w:trHeight w:val="288"/>
-          <w:jc w:val="center"/>
-        </w:trPr>
-        <w:tc>
-          <w:tcPr>
-            <w:tcW w:w="1594" w:type="dxa"/>
-            <w:noWrap/>
-            <w:hideMark/>
-          </w:tcPr>
-          <w:p>
-            <w:pPr>
-              <w:rPr>
-                <w:rFonts w:ascii="Garamond" w:hAnsi="Garamond"/>
-                <w:strike/>
-                <w:sz w:val="24"/>
-                <w:szCs w:val="24"/>
-              </w:rPr>
-            </w:pPr>
-            <w:r>
-              <w:rPr>
-                <w:rFonts w:ascii="Garamond" w:hAnsi="Garamond"/>
-                <w:strike/>
-                <w:sz w:val="24"/>
-                <w:szCs w:val="24"/>
-              </w:rPr>
-              <w:t>AMLR03</w:t>
-            </w:r>
-          </w:p>
-        </w:tc>
-        <w:tc>
-          <w:tcPr>
-            <w:tcW w:w="1200" w:type="dxa"/>
-            <w:noWrap/>
-          </w:tcPr>
-          <w:p>
-            <w:pPr>
-              <w:jc w:val="center"/>
-              <w:rPr>
-                <w:rFonts w:ascii="Garamond" w:hAnsi="Garamond"/>
-                <w:strike/>
-                <w:sz w:val="24"/>
-                <w:szCs w:val="24"/>
-              </w:rPr>
-            </w:pPr>
-            <w:r>
-              <w:rPr>
-                <w:rFonts w:ascii="Garamond" w:hAnsi="Garamond"/>
-                <w:strike/>
-                <w:sz w:val="24"/>
-                <w:szCs w:val="24"/>
-              </w:rPr>
-              <w:t>48.84</w:t>
-            </w:r>
-          </w:p>
-        </w:tc>
-        <w:tc>
-          <w:tcPr>
-            <w:tcW w:w="1200" w:type="dxa"/>
-          </w:tcPr>
-          <w:p>
-            <w:pPr>
-              <w:jc w:val="center"/>
-              <w:rPr>
-                <w:rFonts w:ascii="Garamond" w:hAnsi="Garamond"/>
-                <w:strike/>
-                <w:sz w:val="24"/>
-                <w:szCs w:val="24"/>
-              </w:rPr>
-            </w:pPr>
-            <w:r>
-              <w:rPr>
-                <w:rFonts w:ascii="Garamond" w:hAnsi="Garamond"/>
-                <w:strike/>
-                <w:sz w:val="24"/>
-                <w:szCs w:val="24"/>
-              </w:rPr>
-              <w:t>38.24</w:t>
-            </w:r>
-          </w:p>
-        </w:tc>
-        <w:tc>
-          <w:tcPr>
-            <w:tcW w:w="1200" w:type="dxa"/>
-            <w:noWrap/>
-          </w:tcPr>
-          <w:p>
-            <w:pPr>
-              <w:jc w:val="center"/>
-              <w:rPr>
-                <w:rFonts w:ascii="Garamond" w:hAnsi="Garamond"/>
-                <w:strike/>
-                <w:sz w:val="24"/>
-                <w:szCs w:val="24"/>
-              </w:rPr>
-            </w:pPr>
-            <w:r>
-              <w:rPr>
-                <w:rFonts w:ascii="Garamond" w:hAnsi="Garamond"/>
-                <w:strike/>
-                <w:sz w:val="24"/>
-                <w:szCs w:val="24"/>
-              </w:rPr>
-              <w:t>63.39</w:t>
-            </w:r>
-          </w:p>
-        </w:tc>
-        <w:tc>
-          <w:tcPr>
-            <w:tcW w:w="1200" w:type="dxa"/>
-            <w:noWrap/>
-          </w:tcPr>
-          <w:p>
-            <w:pPr>
-              <w:jc w:val="center"/>
-              <w:rPr>
-                <w:rFonts w:ascii="Garamond" w:hAnsi="Garamond"/>
-                <w:strike/>
-                <w:sz w:val="24"/>
-                <w:szCs w:val="24"/>
-              </w:rPr>
-            </w:pPr>
-            <w:r>
-              <w:rPr>
-                <w:rFonts w:ascii="Garamond" w:hAnsi="Garamond"/>
-                <w:strike/>
-                <w:sz w:val="24"/>
-                <w:szCs w:val="24"/>
-              </w:rPr>
-              <w:t>38.05</w:t>
-            </w:r>
-          </w:p>
-        </w:tc>
-        <w:tc>
-          <w:tcPr>
-            <w:tcW w:w="960" w:type="dxa"/>
-          </w:tcPr>
-          <w:p>
-            <w:pPr>
-              <w:jc w:val="center"/>
-              <w:rPr>
-                <w:rFonts w:ascii="Garamond" w:hAnsi="Garamond"/>
-                <w:strike/>
-                <w:sz w:val="24"/>
-                <w:szCs w:val="24"/>
-              </w:rPr>
-            </w:pPr>
-            <w:r>
-              <w:rPr>
-                <w:rFonts w:ascii="Garamond" w:hAnsi="Garamond"/>
-                <w:strike/>
-                <w:sz w:val="24"/>
-                <w:szCs w:val="24"/>
-              </w:rPr>
-              <w:t>29.39</w:t>
-            </w:r>
-          </w:p>
-        </w:tc>
-        <w:tc>
-          <w:tcPr>
-            <w:tcW w:w="960" w:type="dxa"/>
-            <w:noWrap/>
-          </w:tcPr>
-          <w:p>
-            <w:pPr>
-              <w:jc w:val="center"/>
-              <w:rPr>
-                <w:rFonts w:ascii="Garamond" w:hAnsi="Garamond"/>
-                <w:strike/>
-                <w:sz w:val="24"/>
-                <w:szCs w:val="24"/>
-              </w:rPr>
-            </w:pPr>
-            <w:r>
-              <w:rPr>
-                <w:rFonts w:ascii="Garamond" w:hAnsi="Garamond"/>
-                <w:strike/>
-                <w:sz w:val="24"/>
-                <w:szCs w:val="24"/>
-              </w:rPr>
-              <w:t>49.38</w:t>
-            </w:r>
-          </w:p>
-        </w:tc>
-        <w:tc>
-          <w:tcPr>
-            <w:tcW w:w="960" w:type="dxa"/>
-          </w:tcPr>
-          <w:p>
-            <w:pPr>
-              <w:jc w:val="center"/>
-              <w:rPr>
-                <w:rFonts w:ascii="Garamond" w:hAnsi="Garamond"/>
-                <w:strike/>
-                <w:sz w:val="24"/>
-                <w:szCs w:val="24"/>
-              </w:rPr>
-            </w:pPr>
-            <w:r>
-              <w:rPr>
-                <w:rFonts w:ascii="Garamond" w:hAnsi="Garamond"/>
-                <w:strike/>
-                <w:sz w:val="24"/>
-                <w:szCs w:val="24"/>
-              </w:rPr>
-              <w:t>115</w:t>
-            </w:r>
-          </w:p>
-        </w:tc>
-      </w:tr>
-      <w:tr>
-        <w:trPr>
-          <w:trHeight w:val="288"/>
-          <w:jc w:val="center"/>
-        </w:trPr>
-        <w:tc>
-          <w:tcPr>
-            <w:tcW w:w="1594" w:type="dxa"/>
-            <w:noWrap/>
-            <w:hideMark/>
-          </w:tcPr>
-          <w:p>
-            <w:pPr>
-              <w:rPr>
-                <w:rFonts w:ascii="Garamond" w:hAnsi="Garamond"/>
-                <w:strike/>
-                <w:sz w:val="24"/>
-                <w:szCs w:val="24"/>
-              </w:rPr>
-            </w:pPr>
-            <w:r>
-              <w:rPr>
-                <w:rFonts w:ascii="Garamond" w:hAnsi="Garamond"/>
-                <w:strike/>
-                <w:sz w:val="24"/>
-                <w:szCs w:val="24"/>
-              </w:rPr>
-              <w:t>AMLR04</w:t>
-            </w:r>
-          </w:p>
-        </w:tc>
-        <w:tc>
-          <w:tcPr>
-            <w:tcW w:w="1200" w:type="dxa"/>
-            <w:noWrap/>
-          </w:tcPr>
-          <w:p>
-            <w:pPr>
-              <w:jc w:val="center"/>
-              <w:rPr>
-                <w:rFonts w:ascii="Garamond" w:hAnsi="Garamond"/>
-                <w:strike/>
-                <w:sz w:val="24"/>
-                <w:szCs w:val="24"/>
-              </w:rPr>
-            </w:pPr>
-            <w:r>
-              <w:rPr>
-                <w:rFonts w:ascii="Garamond" w:hAnsi="Garamond"/>
-                <w:strike/>
-                <w:sz w:val="24"/>
-                <w:szCs w:val="24"/>
-              </w:rPr>
-              <w:t>42.55</w:t>
-            </w:r>
-          </w:p>
-        </w:tc>
-        <w:tc>
-          <w:tcPr>
-            <w:tcW w:w="1200" w:type="dxa"/>
-          </w:tcPr>
-          <w:p>
-            <w:pPr>
-              <w:jc w:val="center"/>
-              <w:rPr>
-                <w:rFonts w:ascii="Garamond" w:hAnsi="Garamond"/>
-                <w:strike/>
-                <w:sz w:val="24"/>
-                <w:szCs w:val="24"/>
-              </w:rPr>
-            </w:pPr>
-            <w:r>
-              <w:rPr>
-                <w:rFonts w:ascii="Garamond" w:hAnsi="Garamond"/>
-                <w:strike/>
-                <w:sz w:val="24"/>
-                <w:szCs w:val="24"/>
-              </w:rPr>
-              <w:t>31.14</w:t>
-            </w:r>
-          </w:p>
-        </w:tc>
-        <w:tc>
-          <w:tcPr>
-            <w:tcW w:w="1200" w:type="dxa"/>
-            <w:noWrap/>
-          </w:tcPr>
-          <w:p>
-            <w:pPr>
-              <w:jc w:val="center"/>
-              <w:rPr>
-                <w:rFonts w:ascii="Garamond" w:hAnsi="Garamond"/>
-                <w:strike/>
-                <w:sz w:val="24"/>
-                <w:szCs w:val="24"/>
-              </w:rPr>
-            </w:pPr>
-            <w:r>
-              <w:rPr>
-                <w:rFonts w:ascii="Garamond" w:hAnsi="Garamond"/>
-                <w:strike/>
-                <w:sz w:val="24"/>
-                <w:szCs w:val="24"/>
-              </w:rPr>
-              <w:t>66.10</w:t>
-            </w:r>
-          </w:p>
-        </w:tc>
-        <w:tc>
-          <w:tcPr>
-            <w:tcW w:w="1200" w:type="dxa"/>
-            <w:noWrap/>
-          </w:tcPr>
-          <w:p>
-            <w:pPr>
-              <w:jc w:val="center"/>
-              <w:rPr>
-                <w:rFonts w:ascii="Garamond" w:hAnsi="Garamond"/>
-                <w:strike/>
-                <w:sz w:val="24"/>
-                <w:szCs w:val="24"/>
-              </w:rPr>
-            </w:pPr>
-            <w:r>
-              <w:rPr>
-                <w:rFonts w:ascii="Garamond" w:hAnsi="Garamond"/>
-                <w:strike/>
-                <w:sz w:val="24"/>
-                <w:szCs w:val="24"/>
-              </w:rPr>
-              <w:t>41.34</w:t>
-            </w:r>
-          </w:p>
-        </w:tc>
-        <w:tc>
-          <w:tcPr>
-            <w:tcW w:w="960" w:type="dxa"/>
-          </w:tcPr>
-          <w:p>
-            <w:pPr>
-              <w:jc w:val="center"/>
-              <w:rPr>
-                <w:rFonts w:ascii="Garamond" w:hAnsi="Garamond"/>
-                <w:strike/>
-                <w:sz w:val="24"/>
-                <w:szCs w:val="24"/>
-              </w:rPr>
-            </w:pPr>
-            <w:r>
-              <w:rPr>
-                <w:rFonts w:ascii="Garamond" w:hAnsi="Garamond"/>
-                <w:strike/>
-                <w:sz w:val="24"/>
-                <w:szCs w:val="24"/>
-              </w:rPr>
-              <w:t>27.54</w:t>
-            </w:r>
-          </w:p>
-        </w:tc>
-        <w:tc>
-          <w:tcPr>
-            <w:tcW w:w="960" w:type="dxa"/>
-            <w:noWrap/>
-          </w:tcPr>
-          <w:p>
-            <w:pPr>
-              <w:jc w:val="center"/>
-              <w:rPr>
-                <w:rFonts w:ascii="Garamond" w:hAnsi="Garamond"/>
-                <w:strike/>
-                <w:sz w:val="24"/>
-                <w:szCs w:val="24"/>
-              </w:rPr>
-            </w:pPr>
-            <w:r>
-              <w:rPr>
-                <w:rFonts w:ascii="Garamond" w:hAnsi="Garamond"/>
-                <w:strike/>
-                <w:sz w:val="24"/>
-                <w:szCs w:val="24"/>
-              </w:rPr>
-              <w:t>63.47</w:t>
-            </w:r>
-          </w:p>
-        </w:tc>
-        <w:tc>
-          <w:tcPr>
-            <w:tcW w:w="960" w:type="dxa"/>
-          </w:tcPr>
-          <w:p>
-            <w:pPr>
-              <w:jc w:val="center"/>
-              <w:rPr>
-                <w:rFonts w:ascii="Garamond" w:hAnsi="Garamond"/>
-                <w:strike/>
-                <w:sz w:val="24"/>
-                <w:szCs w:val="24"/>
-              </w:rPr>
-            </w:pPr>
-            <w:r>
-              <w:rPr>
-                <w:rFonts w:ascii="Garamond" w:hAnsi="Garamond"/>
-                <w:strike/>
-                <w:sz w:val="24"/>
-                <w:szCs w:val="24"/>
-              </w:rPr>
-              <w:t>117</w:t>
-            </w:r>
-          </w:p>
-        </w:tc>
-      </w:tr>
-    </w:tbl>
     <w:p/>
     <w:p/>
     <w:p>
@@ -5460,6 +4757,24 @@
               <w:t>70 kHz density</w:t>
             </w:r>
           </w:p>
+          <w:p>
+            <w:pPr>
+              <w:jc w:val="center"/>
+              <w:rPr>
+                <w:rFonts w:ascii="Garamond" w:hAnsi="Garamond"/>
+                <w:sz w:val="24"/>
+                <w:szCs w:val="24"/>
+              </w:rPr>
+            </w:pPr>
+            <w:r>
+              <w:rPr>
+                <w:rFonts w:ascii="Garamond" w:hAnsi="Garamond"/>
+                <w:sz w:val="24"/>
+                <w:szCs w:val="24"/>
+              </w:rPr>
+              <w:t>(g/m2)</w:t>
+            </w:r>
+          </w:p>
         </w:tc>
         <w:tc>
           <w:tcPr>
@@ -5531,6 +4846,24 @@
                 <w:szCs w:val="24"/>
               </w:rPr>
               <w:t>120 kHz density</w:t>
+            </w:r>
+          </w:p>
+          <w:p>
+            <w:pPr>
+              <w:jc w:val="center"/>
+              <w:rPr>
+                <w:rFonts w:ascii="Garamond" w:hAnsi="Garamond"/>
+                <w:sz w:val="24"/>
+                <w:szCs w:val="24"/>
+              </w:rPr>
+            </w:pPr>
+            <w:r>
+              <w:rPr>
+                <w:rFonts w:ascii="Garamond" w:hAnsi="Garamond"/>
+                <w:sz w:val="24"/>
+                <w:szCs w:val="24"/>
+              </w:rPr>
+              <w:t>(g/m2)</w:t>
             </w:r>
           </w:p>
         </w:tc>
@@ -6020,7 +5353,6 @@
                 <w:sz w:val="24"/>
                 <w:szCs w:val="24"/>
               </w:rPr>
-              <w:lastRenderedPageBreak/>
               <w:t>Schools</w:t>
             </w:r>
           </w:p>
@@ -6673,6 +6005,24 @@
               <w:t>70 kHz density</w:t>
             </w:r>
           </w:p>
+          <w:p>
+            <w:pPr>
+              <w:jc w:val="center"/>
+              <w:rPr>
+                <w:rFonts w:ascii="Garamond" w:hAnsi="Garamond"/>
+                <w:sz w:val="24"/>
+                <w:szCs w:val="24"/>
+              </w:rPr>
+            </w:pPr>
+            <w:r>
+              <w:rPr>
+                <w:rFonts w:ascii="Garamond" w:hAnsi="Garamond"/>
+                <w:sz w:val="24"/>
+                <w:szCs w:val="24"/>
+              </w:rPr>
+              <w:t>(g/m2)</w:t>
+            </w:r>
+          </w:p>
         </w:tc>
         <w:tc>
           <w:tcPr>
@@ -6744,6 +6094,24 @@
                 <w:szCs w:val="24"/>
               </w:rPr>
               <w:t>120 kHz density</w:t>
+            </w:r>
+          </w:p>
+          <w:p>
+            <w:pPr>
+              <w:jc w:val="center"/>
+              <w:rPr>
+                <w:rFonts w:ascii="Garamond" w:hAnsi="Garamond"/>
+                <w:sz w:val="24"/>
+                <w:szCs w:val="24"/>
+              </w:rPr>
+            </w:pPr>
+            <w:r>
+              <w:rPr>
+                <w:rFonts w:ascii="Garamond" w:hAnsi="Garamond"/>
+                <w:sz w:val="24"/>
+                <w:szCs w:val="24"/>
+              </w:rPr>
+              <w:t>(g/m2)</w:t>
             </w:r>
           </w:p>
         </w:tc>
@@ -8952,19 +8320,7 @@
         <w:annotationRef/>
       </w:r>
       <w:r>
-        <w:t xml:space="preserve">The same area is used to calculate both this and the survey. May need to </w:t>
-      </w:r>
-      <w:r>
-        <w:t>change</w:t>
-      </w:r>
-      <w:r>
-        <w:t xml:space="preserve"> the area</w:t>
-      </w:r>
-      <w:r>
-        <w:t xml:space="preserve"> for entire data set</w:t>
-      </w:r>
-      <w:r>
-        <w:t>.</w:t>
+        <w:t>The same area is used to calculate both this and the survey. May need to change the area for entire data set.</w:t>
       </w:r>
     </w:p>
   </w:comment>

</xml_diff>